<commit_message>
update:document and version configure
</commit_message>
<xml_diff>
--- a/XEngine_Docment/Docment_en.docx
+++ b/XEngine_Docment/Docment_en.docx
@@ -11,7 +11,7 @@
           <w:szCs w:val="44"/>
         </w:rPr>
       </w:pPr>
-      <w:bookmarkStart w:id="0" w:name="_Toc217309193"/>
+      <w:bookmarkStart w:id="0" w:name="_Toc224562768"/>
       <w:r>
         <w:rPr>
           <w:rFonts w:hint="eastAsia"/>
@@ -76,7 +76,7 @@
           <w:r>
             <w:fldChar w:fldCharType="separate"/>
           </w:r>
-          <w:hyperlink w:anchor="_Toc217309193" w:history="1">
+          <w:hyperlink w:anchor="_Toc224562768" w:history="1">
             <w:r>
               <w:rPr>
                 <w:rStyle w:val="ae"/>
@@ -114,7 +114,7 @@
                 <w:noProof/>
                 <w:webHidden/>
               </w:rPr>
-              <w:instrText>PAGEREF _Toc217309193 \h</w:instrText>
+              <w:instrText>PAGEREF _Toc224562768 \h</w:instrText>
             </w:r>
             <w:r>
               <w:rPr>
@@ -170,7 +170,7 @@
               <w14:ligatures w14:val="standardContextual"/>
             </w:rPr>
           </w:pPr>
-          <w:hyperlink w:anchor="_Toc217309194" w:history="1">
+          <w:hyperlink w:anchor="_Toc224562769" w:history="1">
             <w:r>
               <w:rPr>
                 <w:rStyle w:val="ae"/>
@@ -208,7 +208,7 @@
                 <w:noProof/>
                 <w:webHidden/>
               </w:rPr>
-              <w:instrText>PAGEREF _Toc217309194 \h</w:instrText>
+              <w:instrText>PAGEREF _Toc224562769 \h</w:instrText>
             </w:r>
             <w:r>
               <w:rPr>
@@ -264,7 +264,7 @@
               <w14:ligatures w14:val="standardContextual"/>
             </w:rPr>
           </w:pPr>
-          <w:hyperlink w:anchor="_Toc217309195" w:history="1">
+          <w:hyperlink w:anchor="_Toc224562770" w:history="1">
             <w:r>
               <w:rPr>
                 <w:rStyle w:val="ae"/>
@@ -302,7 +302,7 @@
                 <w:noProof/>
                 <w:webHidden/>
               </w:rPr>
-              <w:instrText>PAGEREF _Toc217309195 \h</w:instrText>
+              <w:instrText>PAGEREF _Toc224562770 \h</w:instrText>
             </w:r>
             <w:r>
               <w:rPr>
@@ -358,7 +358,7 @@
               <w14:ligatures w14:val="standardContextual"/>
             </w:rPr>
           </w:pPr>
-          <w:hyperlink w:anchor="_Toc217309196" w:history="1">
+          <w:hyperlink w:anchor="_Toc224562771" w:history="1">
             <w:r>
               <w:rPr>
                 <w:rStyle w:val="ae"/>
@@ -396,7 +396,7 @@
                 <w:noProof/>
                 <w:webHidden/>
               </w:rPr>
-              <w:instrText>PAGEREF _Toc217309196 \h</w:instrText>
+              <w:instrText>PAGEREF _Toc224562771 \h</w:instrText>
             </w:r>
             <w:r>
               <w:rPr>
@@ -452,7 +452,7 @@
               <w14:ligatures w14:val="standardContextual"/>
             </w:rPr>
           </w:pPr>
-          <w:hyperlink w:anchor="_Toc217309197" w:history="1">
+          <w:hyperlink w:anchor="_Toc224562772" w:history="1">
             <w:r>
               <w:rPr>
                 <w:rStyle w:val="ae"/>
@@ -490,7 +490,7 @@
                 <w:noProof/>
                 <w:webHidden/>
               </w:rPr>
-              <w:instrText>PAGEREF _Toc217309197 \h</w:instrText>
+              <w:instrText>PAGEREF _Toc224562772 \h</w:instrText>
             </w:r>
             <w:r>
               <w:rPr>
@@ -546,7 +546,7 @@
               <w14:ligatures w14:val="standardContextual"/>
             </w:rPr>
           </w:pPr>
-          <w:hyperlink w:anchor="_Toc217309198" w:history="1">
+          <w:hyperlink w:anchor="_Toc224562773" w:history="1">
             <w:r>
               <w:rPr>
                 <w:rStyle w:val="ae"/>
@@ -592,7 +592,7 @@
                 <w:noProof/>
                 <w:webHidden/>
               </w:rPr>
-              <w:instrText>PAGEREF _Toc217309198 \h</w:instrText>
+              <w:instrText>PAGEREF _Toc224562773 \h</w:instrText>
             </w:r>
             <w:r>
               <w:rPr>
@@ -648,7 +648,7 @@
               <w14:ligatures w14:val="standardContextual"/>
             </w:rPr>
           </w:pPr>
-          <w:hyperlink w:anchor="_Toc217309199" w:history="1">
+          <w:hyperlink w:anchor="_Toc224562774" w:history="1">
             <w:r>
               <w:rPr>
                 <w:rStyle w:val="ae"/>
@@ -686,7 +686,7 @@
                 <w:noProof/>
                 <w:webHidden/>
               </w:rPr>
-              <w:instrText>PAGEREF _Toc217309199 \h</w:instrText>
+              <w:instrText>PAGEREF _Toc224562774 \h</w:instrText>
             </w:r>
             <w:r>
               <w:rPr>
@@ -742,7 +742,7 @@
               <w14:ligatures w14:val="standardContextual"/>
             </w:rPr>
           </w:pPr>
-          <w:hyperlink w:anchor="_Toc217309200" w:history="1">
+          <w:hyperlink w:anchor="_Toc224562775" w:history="1">
             <w:r>
               <w:rPr>
                 <w:rStyle w:val="ae"/>
@@ -780,7 +780,7 @@
                 <w:noProof/>
                 <w:webHidden/>
               </w:rPr>
-              <w:instrText>PAGEREF _Toc217309200 \h</w:instrText>
+              <w:instrText>PAGEREF _Toc224562775 \h</w:instrText>
             </w:r>
             <w:r>
               <w:rPr>
@@ -836,7 +836,7 @@
               <w14:ligatures w14:val="standardContextual"/>
             </w:rPr>
           </w:pPr>
-          <w:hyperlink w:anchor="_Toc217309201" w:history="1">
+          <w:hyperlink w:anchor="_Toc224562776" w:history="1">
             <w:r>
               <w:rPr>
                 <w:rStyle w:val="ae"/>
@@ -874,7 +874,7 @@
                 <w:noProof/>
                 <w:webHidden/>
               </w:rPr>
-              <w:instrText>PAGEREF _Toc217309201 \h</w:instrText>
+              <w:instrText>PAGEREF _Toc224562776 \h</w:instrText>
             </w:r>
             <w:r>
               <w:rPr>
@@ -930,7 +930,7 @@
               <w14:ligatures w14:val="standardContextual"/>
             </w:rPr>
           </w:pPr>
-          <w:hyperlink w:anchor="_Toc217309202" w:history="1">
+          <w:hyperlink w:anchor="_Toc224562777" w:history="1">
             <w:r>
               <w:rPr>
                 <w:rStyle w:val="ae"/>
@@ -968,7 +968,7 @@
                 <w:noProof/>
                 <w:webHidden/>
               </w:rPr>
-              <w:instrText>PAGEREF _Toc217309202 \h</w:instrText>
+              <w:instrText>PAGEREF _Toc224562777 \h</w:instrText>
             </w:r>
             <w:r>
               <w:rPr>
@@ -1024,7 +1024,7 @@
               <w14:ligatures w14:val="standardContextual"/>
             </w:rPr>
           </w:pPr>
-          <w:hyperlink w:anchor="_Toc217309203" w:history="1">
+          <w:hyperlink w:anchor="_Toc224562778" w:history="1">
             <w:r>
               <w:rPr>
                 <w:rStyle w:val="ae"/>
@@ -1062,7 +1062,7 @@
                 <w:noProof/>
                 <w:webHidden/>
               </w:rPr>
-              <w:instrText>PAGEREF _Toc217309203 \h</w:instrText>
+              <w:instrText>PAGEREF _Toc224562778 \h</w:instrText>
             </w:r>
             <w:r>
               <w:rPr>
@@ -1118,7 +1118,7 @@
               <w14:ligatures w14:val="standardContextual"/>
             </w:rPr>
           </w:pPr>
-          <w:hyperlink w:anchor="_Toc217309204" w:history="1">
+          <w:hyperlink w:anchor="_Toc224562779" w:history="1">
             <w:r>
               <w:rPr>
                 <w:rStyle w:val="ae"/>
@@ -1156,7 +1156,7 @@
                 <w:noProof/>
                 <w:webHidden/>
               </w:rPr>
-              <w:instrText>PAGEREF _Toc217309204 \h</w:instrText>
+              <w:instrText>PAGEREF _Toc224562779 \h</w:instrText>
             </w:r>
             <w:r>
               <w:rPr>
@@ -1212,7 +1212,7 @@
               <w14:ligatures w14:val="standardContextual"/>
             </w:rPr>
           </w:pPr>
-          <w:hyperlink w:anchor="_Toc217309205" w:history="1">
+          <w:hyperlink w:anchor="_Toc224562780" w:history="1">
             <w:r>
               <w:rPr>
                 <w:rStyle w:val="ae"/>
@@ -1250,7 +1250,7 @@
                 <w:noProof/>
                 <w:webHidden/>
               </w:rPr>
-              <w:instrText>PAGEREF _Toc217309205 \h</w:instrText>
+              <w:instrText>PAGEREF _Toc224562780 \h</w:instrText>
             </w:r>
             <w:r>
               <w:rPr>
@@ -1306,7 +1306,7 @@
               <w14:ligatures w14:val="standardContextual"/>
             </w:rPr>
           </w:pPr>
-          <w:hyperlink w:anchor="_Toc217309206" w:history="1">
+          <w:hyperlink w:anchor="_Toc224562781" w:history="1">
             <w:r>
               <w:rPr>
                 <w:rStyle w:val="ae"/>
@@ -1352,7 +1352,7 @@
                 <w:noProof/>
                 <w:webHidden/>
               </w:rPr>
-              <w:instrText>PAGEREF _Toc217309206 \h</w:instrText>
+              <w:instrText>PAGEREF _Toc224562781 \h</w:instrText>
             </w:r>
             <w:r>
               <w:rPr>
@@ -1408,7 +1408,7 @@
               <w14:ligatures w14:val="standardContextual"/>
             </w:rPr>
           </w:pPr>
-          <w:hyperlink w:anchor="_Toc217309207" w:history="1">
+          <w:hyperlink w:anchor="_Toc224562782" w:history="1">
             <w:r>
               <w:rPr>
                 <w:rStyle w:val="ae"/>
@@ -1446,7 +1446,7 @@
                 <w:noProof/>
                 <w:webHidden/>
               </w:rPr>
-              <w:instrText>PAGEREF _Toc217309207 \h</w:instrText>
+              <w:instrText>PAGEREF _Toc224562782 \h</w:instrText>
             </w:r>
             <w:r>
               <w:rPr>
@@ -1502,7 +1502,7 @@
               <w14:ligatures w14:val="standardContextual"/>
             </w:rPr>
           </w:pPr>
-          <w:hyperlink w:anchor="_Toc217309208" w:history="1">
+          <w:hyperlink w:anchor="_Toc224562783" w:history="1">
             <w:r>
               <w:rPr>
                 <w:rStyle w:val="ae"/>
@@ -1540,7 +1540,7 @@
                 <w:noProof/>
                 <w:webHidden/>
               </w:rPr>
-              <w:instrText>PAGEREF _Toc217309208 \h</w:instrText>
+              <w:instrText>PAGEREF _Toc224562783 \h</w:instrText>
             </w:r>
             <w:r>
               <w:rPr>
@@ -1596,7 +1596,7 @@
               <w14:ligatures w14:val="standardContextual"/>
             </w:rPr>
           </w:pPr>
-          <w:hyperlink w:anchor="_Toc217309209" w:history="1">
+          <w:hyperlink w:anchor="_Toc224562784" w:history="1">
             <w:r>
               <w:rPr>
                 <w:rStyle w:val="ae"/>
@@ -1634,7 +1634,7 @@
                 <w:noProof/>
                 <w:webHidden/>
               </w:rPr>
-              <w:instrText>PAGEREF _Toc217309209 \h</w:instrText>
+              <w:instrText>PAGEREF _Toc224562784 \h</w:instrText>
             </w:r>
             <w:r>
               <w:rPr>
@@ -1690,7 +1690,7 @@
               <w14:ligatures w14:val="standardContextual"/>
             </w:rPr>
           </w:pPr>
-          <w:hyperlink w:anchor="_Toc217309210" w:history="1">
+          <w:hyperlink w:anchor="_Toc224562785" w:history="1">
             <w:r>
               <w:rPr>
                 <w:rStyle w:val="ae"/>
@@ -1728,7 +1728,7 @@
                 <w:noProof/>
                 <w:webHidden/>
               </w:rPr>
-              <w:instrText>PAGEREF _Toc217309210 \h</w:instrText>
+              <w:instrText>PAGEREF _Toc224562785 \h</w:instrText>
             </w:r>
             <w:r>
               <w:rPr>
@@ -1784,7 +1784,7 @@
               <w14:ligatures w14:val="standardContextual"/>
             </w:rPr>
           </w:pPr>
-          <w:hyperlink w:anchor="_Toc217309211" w:history="1">
+          <w:hyperlink w:anchor="_Toc224562786" w:history="1">
             <w:r>
               <w:rPr>
                 <w:rStyle w:val="ae"/>
@@ -1822,7 +1822,7 @@
                 <w:noProof/>
                 <w:webHidden/>
               </w:rPr>
-              <w:instrText>PAGEREF _Toc217309211 \h</w:instrText>
+              <w:instrText>PAGEREF _Toc224562786 \h</w:instrText>
             </w:r>
             <w:r>
               <w:rPr>
@@ -1878,7 +1878,7 @@
               <w14:ligatures w14:val="standardContextual"/>
             </w:rPr>
           </w:pPr>
-          <w:hyperlink w:anchor="_Toc217309212" w:history="1">
+          <w:hyperlink w:anchor="_Toc224562787" w:history="1">
             <w:r>
               <w:rPr>
                 <w:rStyle w:val="ae"/>
@@ -1916,7 +1916,7 @@
                 <w:noProof/>
                 <w:webHidden/>
               </w:rPr>
-              <w:instrText>PAGEREF _Toc217309212 \h</w:instrText>
+              <w:instrText>PAGEREF _Toc224562787 \h</w:instrText>
             </w:r>
             <w:r>
               <w:rPr>
@@ -1972,7 +1972,7 @@
               <w14:ligatures w14:val="standardContextual"/>
             </w:rPr>
           </w:pPr>
-          <w:hyperlink w:anchor="_Toc217309213" w:history="1">
+          <w:hyperlink w:anchor="_Toc224562788" w:history="1">
             <w:r>
               <w:rPr>
                 <w:rStyle w:val="ae"/>
@@ -2018,7 +2018,7 @@
                 <w:noProof/>
                 <w:webHidden/>
               </w:rPr>
-              <w:instrText>PAGEREF _Toc217309213 \h</w:instrText>
+              <w:instrText>PAGEREF _Toc224562788 \h</w:instrText>
             </w:r>
             <w:r>
               <w:rPr>
@@ -2074,7 +2074,7 @@
               <w14:ligatures w14:val="standardContextual"/>
             </w:rPr>
           </w:pPr>
-          <w:hyperlink w:anchor="_Toc217309214" w:history="1">
+          <w:hyperlink w:anchor="_Toc224562789" w:history="1">
             <w:r>
               <w:rPr>
                 <w:rStyle w:val="ae"/>
@@ -2112,7 +2112,7 @@
                 <w:noProof/>
                 <w:webHidden/>
               </w:rPr>
-              <w:instrText>PAGEREF _Toc217309214 \h</w:instrText>
+              <w:instrText>PAGEREF _Toc224562789 \h</w:instrText>
             </w:r>
             <w:r>
               <w:rPr>
@@ -2168,7 +2168,7 @@
               <w14:ligatures w14:val="standardContextual"/>
             </w:rPr>
           </w:pPr>
-          <w:hyperlink w:anchor="_Toc217309215" w:history="1">
+          <w:hyperlink w:anchor="_Toc224562790" w:history="1">
             <w:r>
               <w:rPr>
                 <w:rStyle w:val="ae"/>
@@ -2206,7 +2206,7 @@
                 <w:noProof/>
                 <w:webHidden/>
               </w:rPr>
-              <w:instrText>PAGEREF _Toc217309215 \h</w:instrText>
+              <w:instrText>PAGEREF _Toc224562790 \h</w:instrText>
             </w:r>
             <w:r>
               <w:rPr>
@@ -2262,7 +2262,7 @@
               <w14:ligatures w14:val="standardContextual"/>
             </w:rPr>
           </w:pPr>
-          <w:hyperlink w:anchor="_Toc217309216" w:history="1">
+          <w:hyperlink w:anchor="_Toc224562791" w:history="1">
             <w:r>
               <w:rPr>
                 <w:rStyle w:val="ae"/>
@@ -2300,7 +2300,7 @@
                 <w:noProof/>
                 <w:webHidden/>
               </w:rPr>
-              <w:instrText>PAGEREF _Toc217309216 \h</w:instrText>
+              <w:instrText>PAGEREF _Toc224562791 \h</w:instrText>
             </w:r>
             <w:r>
               <w:rPr>
@@ -2356,7 +2356,7 @@
               <w14:ligatures w14:val="standardContextual"/>
             </w:rPr>
           </w:pPr>
-          <w:hyperlink w:anchor="_Toc217309217" w:history="1">
+          <w:hyperlink w:anchor="_Toc224562792" w:history="1">
             <w:r>
               <w:rPr>
                 <w:rStyle w:val="ae"/>
@@ -2394,7 +2394,7 @@
                 <w:noProof/>
                 <w:webHidden/>
               </w:rPr>
-              <w:instrText>PAGEREF _Toc217309217 \h</w:instrText>
+              <w:instrText>PAGEREF _Toc224562792 \h</w:instrText>
             </w:r>
             <w:r>
               <w:rPr>
@@ -2450,7 +2450,7 @@
               <w14:ligatures w14:val="standardContextual"/>
             </w:rPr>
           </w:pPr>
-          <w:hyperlink w:anchor="_Toc217309218" w:history="1">
+          <w:hyperlink w:anchor="_Toc224562793" w:history="1">
             <w:r>
               <w:rPr>
                 <w:rStyle w:val="ae"/>
@@ -2496,7 +2496,7 @@
                 <w:noProof/>
                 <w:webHidden/>
               </w:rPr>
-              <w:instrText>PAGEREF _Toc217309218 \h</w:instrText>
+              <w:instrText>PAGEREF _Toc224562793 \h</w:instrText>
             </w:r>
             <w:r>
               <w:rPr>
@@ -2552,7 +2552,7 @@
               <w14:ligatures w14:val="standardContextual"/>
             </w:rPr>
           </w:pPr>
-          <w:hyperlink w:anchor="_Toc217309219" w:history="1">
+          <w:hyperlink w:anchor="_Toc224562794" w:history="1">
             <w:r>
               <w:rPr>
                 <w:rStyle w:val="ae"/>
@@ -2590,7 +2590,7 @@
                 <w:noProof/>
                 <w:webHidden/>
               </w:rPr>
-              <w:instrText>PAGEREF _Toc217309219 \h</w:instrText>
+              <w:instrText>PAGEREF _Toc224562794 \h</w:instrText>
             </w:r>
             <w:r>
               <w:rPr>
@@ -2646,7 +2646,7 @@
               <w14:ligatures w14:val="standardContextual"/>
             </w:rPr>
           </w:pPr>
-          <w:hyperlink w:anchor="_Toc217309220" w:history="1">
+          <w:hyperlink w:anchor="_Toc224562795" w:history="1">
             <w:r>
               <w:rPr>
                 <w:rStyle w:val="ae"/>
@@ -2684,7 +2684,7 @@
                 <w:noProof/>
                 <w:webHidden/>
               </w:rPr>
-              <w:instrText>PAGEREF _Toc217309220 \h</w:instrText>
+              <w:instrText>PAGEREF _Toc224562795 \h</w:instrText>
             </w:r>
             <w:r>
               <w:rPr>
@@ -2740,7 +2740,7 @@
               <w14:ligatures w14:val="standardContextual"/>
             </w:rPr>
           </w:pPr>
-          <w:hyperlink w:anchor="_Toc217309221" w:history="1">
+          <w:hyperlink w:anchor="_Toc224562796" w:history="1">
             <w:r>
               <w:rPr>
                 <w:rStyle w:val="ae"/>
@@ -2778,7 +2778,7 @@
                 <w:noProof/>
                 <w:webHidden/>
               </w:rPr>
-              <w:instrText>PAGEREF _Toc217309221 \h</w:instrText>
+              <w:instrText>PAGEREF _Toc224562796 \h</w:instrText>
             </w:r>
             <w:r>
               <w:rPr>
@@ -2834,7 +2834,7 @@
               <w14:ligatures w14:val="standardContextual"/>
             </w:rPr>
           </w:pPr>
-          <w:hyperlink w:anchor="_Toc217309222" w:history="1">
+          <w:hyperlink w:anchor="_Toc224562797" w:history="1">
             <w:r>
               <w:rPr>
                 <w:rStyle w:val="ae"/>
@@ -2880,7 +2880,7 @@
                 <w:noProof/>
                 <w:webHidden/>
               </w:rPr>
-              <w:instrText>PAGEREF _Toc217309222 \h</w:instrText>
+              <w:instrText>PAGEREF _Toc224562797 \h</w:instrText>
             </w:r>
             <w:r>
               <w:rPr>
@@ -2936,7 +2936,7 @@
               <w14:ligatures w14:val="standardContextual"/>
             </w:rPr>
           </w:pPr>
-          <w:hyperlink w:anchor="_Toc217309223" w:history="1">
+          <w:hyperlink w:anchor="_Toc224562798" w:history="1">
             <w:r>
               <w:rPr>
                 <w:rStyle w:val="ae"/>
@@ -2974,7 +2974,7 @@
                 <w:noProof/>
                 <w:webHidden/>
               </w:rPr>
-              <w:instrText>PAGEREF _Toc217309223 \h</w:instrText>
+              <w:instrText>PAGEREF _Toc224562798 \h</w:instrText>
             </w:r>
             <w:r>
               <w:rPr>
@@ -3030,7 +3030,7 @@
               <w14:ligatures w14:val="standardContextual"/>
             </w:rPr>
           </w:pPr>
-          <w:hyperlink w:anchor="_Toc217309224" w:history="1">
+          <w:hyperlink w:anchor="_Toc224562799" w:history="1">
             <w:r>
               <w:rPr>
                 <w:rStyle w:val="ae"/>
@@ -3068,7 +3068,7 @@
                 <w:noProof/>
                 <w:webHidden/>
               </w:rPr>
-              <w:instrText>PAGEREF _Toc217309224 \h</w:instrText>
+              <w:instrText>PAGEREF _Toc224562799 \h</w:instrText>
             </w:r>
             <w:r>
               <w:rPr>
@@ -3124,7 +3124,7 @@
               <w14:ligatures w14:val="standardContextual"/>
             </w:rPr>
           </w:pPr>
-          <w:hyperlink w:anchor="_Toc217309225" w:history="1">
+          <w:hyperlink w:anchor="_Toc224562800" w:history="1">
             <w:r>
               <w:rPr>
                 <w:rStyle w:val="ae"/>
@@ -3162,7 +3162,7 @@
                 <w:noProof/>
                 <w:webHidden/>
               </w:rPr>
-              <w:instrText>PAGEREF _Toc217309225 \h</w:instrText>
+              <w:instrText>PAGEREF _Toc224562800 \h</w:instrText>
             </w:r>
             <w:r>
               <w:rPr>
@@ -3218,7 +3218,7 @@
               <w14:ligatures w14:val="standardContextual"/>
             </w:rPr>
           </w:pPr>
-          <w:hyperlink w:anchor="_Toc217309226" w:history="1">
+          <w:hyperlink w:anchor="_Toc224562801" w:history="1">
             <w:r>
               <w:rPr>
                 <w:rStyle w:val="ae"/>
@@ -3256,7 +3256,7 @@
                 <w:noProof/>
                 <w:webHidden/>
               </w:rPr>
-              <w:instrText>PAGEREF _Toc217309226 \h</w:instrText>
+              <w:instrText>PAGEREF _Toc224562801 \h</w:instrText>
             </w:r>
             <w:r>
               <w:rPr>
@@ -3312,7 +3312,7 @@
               <w14:ligatures w14:val="standardContextual"/>
             </w:rPr>
           </w:pPr>
-          <w:hyperlink w:anchor="_Toc217309227" w:history="1">
+          <w:hyperlink w:anchor="_Toc224562802" w:history="1">
             <w:r>
               <w:rPr>
                 <w:rStyle w:val="ae"/>
@@ -3350,7 +3350,7 @@
                 <w:noProof/>
                 <w:webHidden/>
               </w:rPr>
-              <w:instrText>PAGEREF _Toc217309227 \h</w:instrText>
+              <w:instrText>PAGEREF _Toc224562802 \h</w:instrText>
             </w:r>
             <w:r>
               <w:rPr>
@@ -3406,7 +3406,7 @@
               <w14:ligatures w14:val="standardContextual"/>
             </w:rPr>
           </w:pPr>
-          <w:hyperlink w:anchor="_Toc217309228" w:history="1">
+          <w:hyperlink w:anchor="_Toc224562803" w:history="1">
             <w:r>
               <w:rPr>
                 <w:rStyle w:val="ae"/>
@@ -3444,7 +3444,7 @@
                 <w:noProof/>
                 <w:webHidden/>
               </w:rPr>
-              <w:instrText>PAGEREF _Toc217309228 \h</w:instrText>
+              <w:instrText>PAGEREF _Toc224562803 \h</w:instrText>
             </w:r>
             <w:r>
               <w:rPr>
@@ -3500,7 +3500,7 @@
               <w14:ligatures w14:val="standardContextual"/>
             </w:rPr>
           </w:pPr>
-          <w:hyperlink w:anchor="_Toc217309229" w:history="1">
+          <w:hyperlink w:anchor="_Toc224562804" w:history="1">
             <w:r>
               <w:rPr>
                 <w:rStyle w:val="ae"/>
@@ -3538,7 +3538,7 @@
                 <w:noProof/>
                 <w:webHidden/>
               </w:rPr>
-              <w:instrText>PAGEREF _Toc217309229 \h</w:instrText>
+              <w:instrText>PAGEREF _Toc224562804 \h</w:instrText>
             </w:r>
             <w:r>
               <w:rPr>
@@ -3594,7 +3594,7 @@
               <w14:ligatures w14:val="standardContextual"/>
             </w:rPr>
           </w:pPr>
-          <w:hyperlink w:anchor="_Toc217309230" w:history="1">
+          <w:hyperlink w:anchor="_Toc224562805" w:history="1">
             <w:r>
               <w:rPr>
                 <w:rStyle w:val="ae"/>
@@ -3632,7 +3632,7 @@
                 <w:noProof/>
                 <w:webHidden/>
               </w:rPr>
-              <w:instrText>PAGEREF _Toc217309230 \h</w:instrText>
+              <w:instrText>PAGEREF _Toc224562805 \h</w:instrText>
             </w:r>
             <w:r>
               <w:rPr>
@@ -3688,7 +3688,7 @@
               <w14:ligatures w14:val="standardContextual"/>
             </w:rPr>
           </w:pPr>
-          <w:hyperlink w:anchor="_Toc217309231" w:history="1">
+          <w:hyperlink w:anchor="_Toc224562806" w:history="1">
             <w:r>
               <w:rPr>
                 <w:rStyle w:val="ae"/>
@@ -3726,7 +3726,7 @@
                 <w:noProof/>
                 <w:webHidden/>
               </w:rPr>
-              <w:instrText>PAGEREF _Toc217309231 \h</w:instrText>
+              <w:instrText>PAGEREF _Toc224562806 \h</w:instrText>
             </w:r>
             <w:r>
               <w:rPr>
@@ -3782,7 +3782,7 @@
               <w14:ligatures w14:val="standardContextual"/>
             </w:rPr>
           </w:pPr>
-          <w:hyperlink w:anchor="_Toc217309232" w:history="1">
+          <w:hyperlink w:anchor="_Toc224562807" w:history="1">
             <w:r>
               <w:rPr>
                 <w:rStyle w:val="ae"/>
@@ -3820,7 +3820,7 @@
                 <w:noProof/>
                 <w:webHidden/>
               </w:rPr>
-              <w:instrText>PAGEREF _Toc217309232 \h</w:instrText>
+              <w:instrText>PAGEREF _Toc224562807 \h</w:instrText>
             </w:r>
             <w:r>
               <w:rPr>
@@ -3876,7 +3876,7 @@
               <w14:ligatures w14:val="standardContextual"/>
             </w:rPr>
           </w:pPr>
-          <w:hyperlink w:anchor="_Toc217309233" w:history="1">
+          <w:hyperlink w:anchor="_Toc224562808" w:history="1">
             <w:r>
               <w:rPr>
                 <w:rStyle w:val="ae"/>
@@ -3914,7 +3914,7 @@
                 <w:noProof/>
                 <w:webHidden/>
               </w:rPr>
-              <w:instrText>PAGEREF _Toc217309233 \h</w:instrText>
+              <w:instrText>PAGEREF _Toc224562808 \h</w:instrText>
             </w:r>
             <w:r>
               <w:rPr>
@@ -3970,7 +3970,7 @@
               <w14:ligatures w14:val="standardContextual"/>
             </w:rPr>
           </w:pPr>
-          <w:hyperlink w:anchor="_Toc217309234" w:history="1">
+          <w:hyperlink w:anchor="_Toc224562809" w:history="1">
             <w:r>
               <w:rPr>
                 <w:rStyle w:val="ae"/>
@@ -4008,7 +4008,7 @@
                 <w:noProof/>
                 <w:webHidden/>
               </w:rPr>
-              <w:instrText>PAGEREF _Toc217309234 \h</w:instrText>
+              <w:instrText>PAGEREF _Toc224562809 \h</w:instrText>
             </w:r>
             <w:r>
               <w:rPr>
@@ -4064,7 +4064,7 @@
               <w14:ligatures w14:val="standardContextual"/>
             </w:rPr>
           </w:pPr>
-          <w:hyperlink w:anchor="_Toc217309235" w:history="1">
+          <w:hyperlink w:anchor="_Toc224562810" w:history="1">
             <w:r>
               <w:rPr>
                 <w:rStyle w:val="ae"/>
@@ -4102,7 +4102,7 @@
                 <w:noProof/>
                 <w:webHidden/>
               </w:rPr>
-              <w:instrText>PAGEREF _Toc217309235 \h</w:instrText>
+              <w:instrText>PAGEREF _Toc224562810 \h</w:instrText>
             </w:r>
             <w:r>
               <w:rPr>
@@ -4158,7 +4158,7 @@
               <w14:ligatures w14:val="standardContextual"/>
             </w:rPr>
           </w:pPr>
-          <w:hyperlink w:anchor="_Toc217309236" w:history="1">
+          <w:hyperlink w:anchor="_Toc224562811" w:history="1">
             <w:r>
               <w:rPr>
                 <w:rStyle w:val="ae"/>
@@ -4196,7 +4196,7 @@
                 <w:noProof/>
                 <w:webHidden/>
               </w:rPr>
-              <w:instrText>PAGEREF _Toc217309236 \h</w:instrText>
+              <w:instrText>PAGEREF _Toc224562811 \h</w:instrText>
             </w:r>
             <w:r>
               <w:rPr>
@@ -4252,7 +4252,7 @@
               <w14:ligatures w14:val="standardContextual"/>
             </w:rPr>
           </w:pPr>
-          <w:hyperlink w:anchor="_Toc217309237" w:history="1">
+          <w:hyperlink w:anchor="_Toc224562812" w:history="1">
             <w:r>
               <w:rPr>
                 <w:rStyle w:val="ae"/>
@@ -4290,7 +4290,7 @@
                 <w:noProof/>
                 <w:webHidden/>
               </w:rPr>
-              <w:instrText>PAGEREF _Toc217309237 \h</w:instrText>
+              <w:instrText>PAGEREF _Toc224562812 \h</w:instrText>
             </w:r>
             <w:r>
               <w:rPr>
@@ -4346,7 +4346,7 @@
               <w14:ligatures w14:val="standardContextual"/>
             </w:rPr>
           </w:pPr>
-          <w:hyperlink w:anchor="_Toc217309238" w:history="1">
+          <w:hyperlink w:anchor="_Toc224562813" w:history="1">
             <w:r>
               <w:rPr>
                 <w:rStyle w:val="ae"/>
@@ -4384,7 +4384,7 @@
                 <w:noProof/>
                 <w:webHidden/>
               </w:rPr>
-              <w:instrText>PAGEREF _Toc217309238 \h</w:instrText>
+              <w:instrText>PAGEREF _Toc224562813 \h</w:instrText>
             </w:r>
             <w:r>
               <w:rPr>
@@ -4440,7 +4440,7 @@
               <w14:ligatures w14:val="standardContextual"/>
             </w:rPr>
           </w:pPr>
-          <w:hyperlink w:anchor="_Toc217309239" w:history="1">
+          <w:hyperlink w:anchor="_Toc224562814" w:history="1">
             <w:r>
               <w:rPr>
                 <w:rStyle w:val="ae"/>
@@ -4478,7 +4478,7 @@
                 <w:noProof/>
                 <w:webHidden/>
               </w:rPr>
-              <w:instrText>PAGEREF _Toc217309239 \h</w:instrText>
+              <w:instrText>PAGEREF _Toc224562814 \h</w:instrText>
             </w:r>
             <w:r>
               <w:rPr>
@@ -4534,7 +4534,7 @@
               <w14:ligatures w14:val="standardContextual"/>
             </w:rPr>
           </w:pPr>
-          <w:hyperlink w:anchor="_Toc217309240" w:history="1">
+          <w:hyperlink w:anchor="_Toc224562815" w:history="1">
             <w:r>
               <w:rPr>
                 <w:rStyle w:val="ae"/>
@@ -4572,7 +4572,7 @@
                 <w:noProof/>
                 <w:webHidden/>
               </w:rPr>
-              <w:instrText>PAGEREF _Toc217309240 \h</w:instrText>
+              <w:instrText>PAGEREF _Toc224562815 \h</w:instrText>
             </w:r>
             <w:r>
               <w:rPr>
@@ -4628,7 +4628,7 @@
               <w14:ligatures w14:val="standardContextual"/>
             </w:rPr>
           </w:pPr>
-          <w:hyperlink w:anchor="_Toc217309241" w:history="1">
+          <w:hyperlink w:anchor="_Toc224562816" w:history="1">
             <w:r>
               <w:rPr>
                 <w:rStyle w:val="ae"/>
@@ -4666,7 +4666,7 @@
                 <w:noProof/>
                 <w:webHidden/>
               </w:rPr>
-              <w:instrText>PAGEREF _Toc217309241 \h</w:instrText>
+              <w:instrText>PAGEREF _Toc224562816 \h</w:instrText>
             </w:r>
             <w:r>
               <w:rPr>
@@ -4722,7 +4722,7 @@
               <w14:ligatures w14:val="standardContextual"/>
             </w:rPr>
           </w:pPr>
-          <w:hyperlink w:anchor="_Toc217309242" w:history="1">
+          <w:hyperlink w:anchor="_Toc224562817" w:history="1">
             <w:r>
               <w:rPr>
                 <w:rStyle w:val="ae"/>
@@ -4760,7 +4760,7 @@
                 <w:noProof/>
                 <w:webHidden/>
               </w:rPr>
-              <w:instrText>PAGEREF _Toc217309242 \h</w:instrText>
+              <w:instrText>PAGEREF _Toc224562817 \h</w:instrText>
             </w:r>
             <w:r>
               <w:rPr>
@@ -4816,7 +4816,7 @@
               <w14:ligatures w14:val="standardContextual"/>
             </w:rPr>
           </w:pPr>
-          <w:hyperlink w:anchor="_Toc217309243" w:history="1">
+          <w:hyperlink w:anchor="_Toc224562818" w:history="1">
             <w:r>
               <w:rPr>
                 <w:rStyle w:val="ae"/>
@@ -4854,7 +4854,7 @@
                 <w:noProof/>
                 <w:webHidden/>
               </w:rPr>
-              <w:instrText>PAGEREF _Toc217309243 \h</w:instrText>
+              <w:instrText>PAGEREF _Toc224562818 \h</w:instrText>
             </w:r>
             <w:r>
               <w:rPr>
@@ -4910,7 +4910,7 @@
               <w14:ligatures w14:val="standardContextual"/>
             </w:rPr>
           </w:pPr>
-          <w:hyperlink w:anchor="_Toc217309244" w:history="1">
+          <w:hyperlink w:anchor="_Toc224562819" w:history="1">
             <w:r>
               <w:rPr>
                 <w:rStyle w:val="ae"/>
@@ -4948,7 +4948,7 @@
                 <w:noProof/>
                 <w:webHidden/>
               </w:rPr>
-              <w:instrText>PAGEREF _Toc217309244 \h</w:instrText>
+              <w:instrText>PAGEREF _Toc224562819 \h</w:instrText>
             </w:r>
             <w:r>
               <w:rPr>
@@ -5004,7 +5004,7 @@
               <w14:ligatures w14:val="standardContextual"/>
             </w:rPr>
           </w:pPr>
-          <w:hyperlink w:anchor="_Toc217309245" w:history="1">
+          <w:hyperlink w:anchor="_Toc224562820" w:history="1">
             <w:r>
               <w:rPr>
                 <w:rStyle w:val="ae"/>
@@ -5042,7 +5042,7 @@
                 <w:noProof/>
                 <w:webHidden/>
               </w:rPr>
-              <w:instrText>PAGEREF _Toc217309245 \h</w:instrText>
+              <w:instrText>PAGEREF _Toc224562820 \h</w:instrText>
             </w:r>
             <w:r>
               <w:rPr>
@@ -5098,7 +5098,7 @@
               <w14:ligatures w14:val="standardContextual"/>
             </w:rPr>
           </w:pPr>
-          <w:hyperlink w:anchor="_Toc217309246" w:history="1">
+          <w:hyperlink w:anchor="_Toc224562821" w:history="1">
             <w:r>
               <w:rPr>
                 <w:rStyle w:val="ae"/>
@@ -5136,7 +5136,7 @@
                 <w:noProof/>
                 <w:webHidden/>
               </w:rPr>
-              <w:instrText>PAGEREF _Toc217309246 \h</w:instrText>
+              <w:instrText>PAGEREF _Toc224562821 \h</w:instrText>
             </w:r>
             <w:r>
               <w:rPr>
@@ -5192,7 +5192,7 @@
               <w14:ligatures w14:val="standardContextual"/>
             </w:rPr>
           </w:pPr>
-          <w:hyperlink w:anchor="_Toc217309247" w:history="1">
+          <w:hyperlink w:anchor="_Toc224562822" w:history="1">
             <w:r>
               <w:rPr>
                 <w:rStyle w:val="ae"/>
@@ -5230,7 +5230,7 @@
                 <w:noProof/>
                 <w:webHidden/>
               </w:rPr>
-              <w:instrText>PAGEREF _Toc217309247 \h</w:instrText>
+              <w:instrText>PAGEREF _Toc224562822 \h</w:instrText>
             </w:r>
             <w:r>
               <w:rPr>
@@ -5286,7 +5286,7 @@
               <w14:ligatures w14:val="standardContextual"/>
             </w:rPr>
           </w:pPr>
-          <w:hyperlink w:anchor="_Toc217309248" w:history="1">
+          <w:hyperlink w:anchor="_Toc224562823" w:history="1">
             <w:r>
               <w:rPr>
                 <w:rStyle w:val="ae"/>
@@ -5324,7 +5324,7 @@
                 <w:noProof/>
                 <w:webHidden/>
               </w:rPr>
-              <w:instrText>PAGEREF _Toc217309248 \h</w:instrText>
+              <w:instrText>PAGEREF _Toc224562823 \h</w:instrText>
             </w:r>
             <w:r>
               <w:rPr>
@@ -5380,7 +5380,7 @@
               <w14:ligatures w14:val="standardContextual"/>
             </w:rPr>
           </w:pPr>
-          <w:hyperlink w:anchor="_Toc217309249" w:history="1">
+          <w:hyperlink w:anchor="_Toc224562824" w:history="1">
             <w:r>
               <w:rPr>
                 <w:rStyle w:val="ae"/>
@@ -5418,7 +5418,7 @@
                 <w:noProof/>
                 <w:webHidden/>
               </w:rPr>
-              <w:instrText>PAGEREF _Toc217309249 \h</w:instrText>
+              <w:instrText>PAGEREF _Toc224562824 \h</w:instrText>
             </w:r>
             <w:r>
               <w:rPr>
@@ -5474,7 +5474,7 @@
               <w14:ligatures w14:val="standardContextual"/>
             </w:rPr>
           </w:pPr>
-          <w:hyperlink w:anchor="_Toc217309250" w:history="1">
+          <w:hyperlink w:anchor="_Toc224562825" w:history="1">
             <w:r>
               <w:rPr>
                 <w:rStyle w:val="ae"/>
@@ -5512,7 +5512,7 @@
                 <w:noProof/>
                 <w:webHidden/>
               </w:rPr>
-              <w:instrText>PAGEREF _Toc217309250 \h</w:instrText>
+              <w:instrText>PAGEREF _Toc224562825 \h</w:instrText>
             </w:r>
             <w:r>
               <w:rPr>
@@ -5568,7 +5568,7 @@
               <w14:ligatures w14:val="standardContextual"/>
             </w:rPr>
           </w:pPr>
-          <w:hyperlink w:anchor="_Toc217309251" w:history="1">
+          <w:hyperlink w:anchor="_Toc224562826" w:history="1">
             <w:r>
               <w:rPr>
                 <w:rStyle w:val="ae"/>
@@ -5606,7 +5606,7 @@
                 <w:noProof/>
                 <w:webHidden/>
               </w:rPr>
-              <w:instrText>PAGEREF _Toc217309251 \h</w:instrText>
+              <w:instrText>PAGEREF _Toc224562826 \h</w:instrText>
             </w:r>
             <w:r>
               <w:rPr>
@@ -5662,7 +5662,7 @@
               <w14:ligatures w14:val="standardContextual"/>
             </w:rPr>
           </w:pPr>
-          <w:hyperlink w:anchor="_Toc217309252" w:history="1">
+          <w:hyperlink w:anchor="_Toc224562827" w:history="1">
             <w:r>
               <w:rPr>
                 <w:rStyle w:val="ae"/>
@@ -5700,7 +5700,7 @@
                 <w:noProof/>
                 <w:webHidden/>
               </w:rPr>
-              <w:instrText>PAGEREF _Toc217309252 \h</w:instrText>
+              <w:instrText>PAGEREF _Toc224562827 \h</w:instrText>
             </w:r>
             <w:r>
               <w:rPr>
@@ -5756,7 +5756,7 @@
               <w14:ligatures w14:val="standardContextual"/>
             </w:rPr>
           </w:pPr>
-          <w:hyperlink w:anchor="_Toc217309253" w:history="1">
+          <w:hyperlink w:anchor="_Toc224562828" w:history="1">
             <w:r>
               <w:rPr>
                 <w:rStyle w:val="ae"/>
@@ -5794,7 +5794,7 @@
                 <w:noProof/>
                 <w:webHidden/>
               </w:rPr>
-              <w:instrText>PAGEREF _Toc217309253 \h</w:instrText>
+              <w:instrText>PAGEREF _Toc224562828 \h</w:instrText>
             </w:r>
             <w:r>
               <w:rPr>
@@ -5850,7 +5850,7 @@
               <w14:ligatures w14:val="standardContextual"/>
             </w:rPr>
           </w:pPr>
-          <w:hyperlink w:anchor="_Toc217309254" w:history="1">
+          <w:hyperlink w:anchor="_Toc224562829" w:history="1">
             <w:r>
               <w:rPr>
                 <w:rStyle w:val="ae"/>
@@ -5888,7 +5888,7 @@
                 <w:noProof/>
                 <w:webHidden/>
               </w:rPr>
-              <w:instrText>PAGEREF _Toc217309254 \h</w:instrText>
+              <w:instrText>PAGEREF _Toc224562829 \h</w:instrText>
             </w:r>
             <w:r>
               <w:rPr>
@@ -5944,7 +5944,7 @@
               <w14:ligatures w14:val="standardContextual"/>
             </w:rPr>
           </w:pPr>
-          <w:hyperlink w:anchor="_Toc217309255" w:history="1">
+          <w:hyperlink w:anchor="_Toc224562830" w:history="1">
             <w:r>
               <w:rPr>
                 <w:rStyle w:val="ae"/>
@@ -5982,7 +5982,7 @@
                 <w:noProof/>
                 <w:webHidden/>
               </w:rPr>
-              <w:instrText>PAGEREF _Toc217309255 \h</w:instrText>
+              <w:instrText>PAGEREF _Toc224562830 \h</w:instrText>
             </w:r>
             <w:r>
               <w:rPr>
@@ -6038,7 +6038,7 @@
               <w14:ligatures w14:val="standardContextual"/>
             </w:rPr>
           </w:pPr>
-          <w:hyperlink w:anchor="_Toc217309256" w:history="1">
+          <w:hyperlink w:anchor="_Toc224562831" w:history="1">
             <w:r>
               <w:rPr>
                 <w:rStyle w:val="ae"/>
@@ -6076,7 +6076,7 @@
                 <w:noProof/>
                 <w:webHidden/>
               </w:rPr>
-              <w:instrText>PAGEREF _Toc217309256 \h</w:instrText>
+              <w:instrText>PAGEREF _Toc224562831 \h</w:instrText>
             </w:r>
             <w:r>
               <w:rPr>
@@ -6132,7 +6132,7 @@
               <w14:ligatures w14:val="standardContextual"/>
             </w:rPr>
           </w:pPr>
-          <w:hyperlink w:anchor="_Toc217309257" w:history="1">
+          <w:hyperlink w:anchor="_Toc224562832" w:history="1">
             <w:r>
               <w:rPr>
                 <w:rStyle w:val="ae"/>
@@ -6170,7 +6170,7 @@
                 <w:noProof/>
                 <w:webHidden/>
               </w:rPr>
-              <w:instrText>PAGEREF _Toc217309257 \h</w:instrText>
+              <w:instrText>PAGEREF _Toc224562832 \h</w:instrText>
             </w:r>
             <w:r>
               <w:rPr>
@@ -6226,7 +6226,7 @@
               <w14:ligatures w14:val="standardContextual"/>
             </w:rPr>
           </w:pPr>
-          <w:hyperlink w:anchor="_Toc217309258" w:history="1">
+          <w:hyperlink w:anchor="_Toc224562833" w:history="1">
             <w:r>
               <w:rPr>
                 <w:rStyle w:val="ae"/>
@@ -6264,7 +6264,7 @@
                 <w:noProof/>
                 <w:webHidden/>
               </w:rPr>
-              <w:instrText>PAGEREF _Toc217309258 \h</w:instrText>
+              <w:instrText>PAGEREF _Toc224562833 \h</w:instrText>
             </w:r>
             <w:r>
               <w:rPr>
@@ -6320,7 +6320,7 @@
               <w14:ligatures w14:val="standardContextual"/>
             </w:rPr>
           </w:pPr>
-          <w:hyperlink w:anchor="_Toc217309259" w:history="1">
+          <w:hyperlink w:anchor="_Toc224562834" w:history="1">
             <w:r>
               <w:rPr>
                 <w:rStyle w:val="ae"/>
@@ -6358,7 +6358,7 @@
                 <w:noProof/>
                 <w:webHidden/>
               </w:rPr>
-              <w:instrText>PAGEREF _Toc217309259 \h</w:instrText>
+              <w:instrText>PAGEREF _Toc224562834 \h</w:instrText>
             </w:r>
             <w:r>
               <w:rPr>
@@ -6414,7 +6414,7 @@
               <w14:ligatures w14:val="standardContextual"/>
             </w:rPr>
           </w:pPr>
-          <w:hyperlink w:anchor="_Toc217309260" w:history="1">
+          <w:hyperlink w:anchor="_Toc224562835" w:history="1">
             <w:r>
               <w:rPr>
                 <w:rStyle w:val="ae"/>
@@ -6452,7 +6452,7 @@
                 <w:noProof/>
                 <w:webHidden/>
               </w:rPr>
-              <w:instrText>PAGEREF _Toc217309260 \h</w:instrText>
+              <w:instrText>PAGEREF _Toc224562835 \h</w:instrText>
             </w:r>
             <w:r>
               <w:rPr>
@@ -6508,7 +6508,7 @@
               <w14:ligatures w14:val="standardContextual"/>
             </w:rPr>
           </w:pPr>
-          <w:hyperlink w:anchor="_Toc217309261" w:history="1">
+          <w:hyperlink w:anchor="_Toc224562836" w:history="1">
             <w:r>
               <w:rPr>
                 <w:rStyle w:val="ae"/>
@@ -6546,7 +6546,7 @@
                 <w:noProof/>
                 <w:webHidden/>
               </w:rPr>
-              <w:instrText>PAGEREF _Toc217309261 \h</w:instrText>
+              <w:instrText>PAGEREF _Toc224562836 \h</w:instrText>
             </w:r>
             <w:r>
               <w:rPr>
@@ -6602,7 +6602,7 @@
               <w14:ligatures w14:val="standardContextual"/>
             </w:rPr>
           </w:pPr>
-          <w:hyperlink w:anchor="_Toc217309262" w:history="1">
+          <w:hyperlink w:anchor="_Toc224562837" w:history="1">
             <w:r>
               <w:rPr>
                 <w:rStyle w:val="ae"/>
@@ -6640,7 +6640,7 @@
                 <w:noProof/>
                 <w:webHidden/>
               </w:rPr>
-              <w:instrText>PAGEREF _Toc217309262 \h</w:instrText>
+              <w:instrText>PAGEREF _Toc224562837 \h</w:instrText>
             </w:r>
             <w:r>
               <w:rPr>
@@ -6696,7 +6696,7 @@
               <w14:ligatures w14:val="standardContextual"/>
             </w:rPr>
           </w:pPr>
-          <w:hyperlink w:anchor="_Toc217309263" w:history="1">
+          <w:hyperlink w:anchor="_Toc224562838" w:history="1">
             <w:r>
               <w:rPr>
                 <w:rStyle w:val="ae"/>
@@ -6734,7 +6734,7 @@
                 <w:noProof/>
                 <w:webHidden/>
               </w:rPr>
-              <w:instrText>PAGEREF _Toc217309263 \h</w:instrText>
+              <w:instrText>PAGEREF _Toc224562838 \h</w:instrText>
             </w:r>
             <w:r>
               <w:rPr>
@@ -6790,7 +6790,7 @@
               <w14:ligatures w14:val="standardContextual"/>
             </w:rPr>
           </w:pPr>
-          <w:hyperlink w:anchor="_Toc217309264" w:history="1">
+          <w:hyperlink w:anchor="_Toc224562839" w:history="1">
             <w:r>
               <w:rPr>
                 <w:rStyle w:val="ae"/>
@@ -6828,7 +6828,7 @@
                 <w:noProof/>
                 <w:webHidden/>
               </w:rPr>
-              <w:instrText>PAGEREF _Toc217309264 \h</w:instrText>
+              <w:instrText>PAGEREF _Toc224562839 \h</w:instrText>
             </w:r>
             <w:r>
               <w:rPr>
@@ -6884,7 +6884,7 @@
               <w14:ligatures w14:val="standardContextual"/>
             </w:rPr>
           </w:pPr>
-          <w:hyperlink w:anchor="_Toc217309265" w:history="1">
+          <w:hyperlink w:anchor="_Toc224562840" w:history="1">
             <w:r>
               <w:rPr>
                 <w:rStyle w:val="ae"/>
@@ -6922,7 +6922,7 @@
                 <w:noProof/>
                 <w:webHidden/>
               </w:rPr>
-              <w:instrText>PAGEREF _Toc217309265 \h</w:instrText>
+              <w:instrText>PAGEREF _Toc224562840 \h</w:instrText>
             </w:r>
             <w:r>
               <w:rPr>
@@ -6978,7 +6978,7 @@
               <w14:ligatures w14:val="standardContextual"/>
             </w:rPr>
           </w:pPr>
-          <w:hyperlink w:anchor="_Toc217309266" w:history="1">
+          <w:hyperlink w:anchor="_Toc224562841" w:history="1">
             <w:r>
               <w:rPr>
                 <w:rStyle w:val="ae"/>
@@ -7016,7 +7016,7 @@
                 <w:noProof/>
                 <w:webHidden/>
               </w:rPr>
-              <w:instrText>PAGEREF _Toc217309266 \h</w:instrText>
+              <w:instrText>PAGEREF _Toc224562841 \h</w:instrText>
             </w:r>
             <w:r>
               <w:rPr>
@@ -7072,7 +7072,7 @@
               <w14:ligatures w14:val="standardContextual"/>
             </w:rPr>
           </w:pPr>
-          <w:hyperlink w:anchor="_Toc217309267" w:history="1">
+          <w:hyperlink w:anchor="_Toc224562842" w:history="1">
             <w:r>
               <w:rPr>
                 <w:rStyle w:val="ae"/>
@@ -7110,7 +7110,7 @@
                 <w:noProof/>
                 <w:webHidden/>
               </w:rPr>
-              <w:instrText>PAGEREF _Toc217309267 \h</w:instrText>
+              <w:instrText>PAGEREF _Toc224562842 \h</w:instrText>
             </w:r>
             <w:r>
               <w:rPr>
@@ -7166,7 +7166,7 @@
               <w14:ligatures w14:val="standardContextual"/>
             </w:rPr>
           </w:pPr>
-          <w:hyperlink w:anchor="_Toc217309268" w:history="1">
+          <w:hyperlink w:anchor="_Toc224562843" w:history="1">
             <w:r>
               <w:rPr>
                 <w:rStyle w:val="ae"/>
@@ -7212,7 +7212,7 @@
                 <w:noProof/>
                 <w:webHidden/>
               </w:rPr>
-              <w:instrText>PAGEREF _Toc217309268 \h</w:instrText>
+              <w:instrText>PAGEREF _Toc224562843 \h</w:instrText>
             </w:r>
             <w:r>
               <w:rPr>
@@ -7268,7 +7268,7 @@
               <w14:ligatures w14:val="standardContextual"/>
             </w:rPr>
           </w:pPr>
-          <w:hyperlink w:anchor="_Toc217309269" w:history="1">
+          <w:hyperlink w:anchor="_Toc224562844" w:history="1">
             <w:r>
               <w:rPr>
                 <w:rStyle w:val="ae"/>
@@ -7306,7 +7306,7 @@
                 <w:noProof/>
                 <w:webHidden/>
               </w:rPr>
-              <w:instrText>PAGEREF _Toc217309269 \h</w:instrText>
+              <w:instrText>PAGEREF _Toc224562844 \h</w:instrText>
             </w:r>
             <w:r>
               <w:rPr>
@@ -7362,7 +7362,7 @@
               <w14:ligatures w14:val="standardContextual"/>
             </w:rPr>
           </w:pPr>
-          <w:hyperlink w:anchor="_Toc217309270" w:history="1">
+          <w:hyperlink w:anchor="_Toc224562845" w:history="1">
             <w:r>
               <w:rPr>
                 <w:rStyle w:val="ae"/>
@@ -7400,7 +7400,7 @@
                 <w:noProof/>
                 <w:webHidden/>
               </w:rPr>
-              <w:instrText>PAGEREF _Toc217309270 \h</w:instrText>
+              <w:instrText>PAGEREF _Toc224562845 \h</w:instrText>
             </w:r>
             <w:r>
               <w:rPr>
@@ -7456,7 +7456,7 @@
               <w14:ligatures w14:val="standardContextual"/>
             </w:rPr>
           </w:pPr>
-          <w:hyperlink w:anchor="_Toc217309271" w:history="1">
+          <w:hyperlink w:anchor="_Toc224562846" w:history="1">
             <w:r>
               <w:rPr>
                 <w:rStyle w:val="ae"/>
@@ -7494,7 +7494,7 @@
                 <w:noProof/>
                 <w:webHidden/>
               </w:rPr>
-              <w:instrText>PAGEREF _Toc217309271 \h</w:instrText>
+              <w:instrText>PAGEREF _Toc224562846 \h</w:instrText>
             </w:r>
             <w:r>
               <w:rPr>
@@ -7550,7 +7550,7 @@
               <w14:ligatures w14:val="standardContextual"/>
             </w:rPr>
           </w:pPr>
-          <w:hyperlink w:anchor="_Toc217309272" w:history="1">
+          <w:hyperlink w:anchor="_Toc224562847" w:history="1">
             <w:r>
               <w:rPr>
                 <w:rStyle w:val="ae"/>
@@ -7588,7 +7588,7 @@
                 <w:noProof/>
                 <w:webHidden/>
               </w:rPr>
-              <w:instrText>PAGEREF _Toc217309272 \h</w:instrText>
+              <w:instrText>PAGEREF _Toc224562847 \h</w:instrText>
             </w:r>
             <w:r>
               <w:rPr>
@@ -7644,7 +7644,7 @@
               <w14:ligatures w14:val="standardContextual"/>
             </w:rPr>
           </w:pPr>
-          <w:hyperlink w:anchor="_Toc217309273" w:history="1">
+          <w:hyperlink w:anchor="_Toc224562848" w:history="1">
             <w:r>
               <w:rPr>
                 <w:rStyle w:val="ae"/>
@@ -7682,7 +7682,7 @@
                 <w:noProof/>
                 <w:webHidden/>
               </w:rPr>
-              <w:instrText>PAGEREF _Toc217309273 \h</w:instrText>
+              <w:instrText>PAGEREF _Toc224562848 \h</w:instrText>
             </w:r>
             <w:r>
               <w:rPr>
@@ -7738,7 +7738,7 @@
               <w14:ligatures w14:val="standardContextual"/>
             </w:rPr>
           </w:pPr>
-          <w:hyperlink w:anchor="_Toc217309274" w:history="1">
+          <w:hyperlink w:anchor="_Toc224562849" w:history="1">
             <w:r>
               <w:rPr>
                 <w:rStyle w:val="ae"/>
@@ -7776,7 +7776,7 @@
                 <w:noProof/>
                 <w:webHidden/>
               </w:rPr>
-              <w:instrText>PAGEREF _Toc217309274 \h</w:instrText>
+              <w:instrText>PAGEREF _Toc224562849 \h</w:instrText>
             </w:r>
             <w:r>
               <w:rPr>
@@ -7832,7 +7832,7 @@
               <w14:ligatures w14:val="standardContextual"/>
             </w:rPr>
           </w:pPr>
-          <w:hyperlink w:anchor="_Toc217309275" w:history="1">
+          <w:hyperlink w:anchor="_Toc224562850" w:history="1">
             <w:r>
               <w:rPr>
                 <w:rStyle w:val="ae"/>
@@ -7870,7 +7870,7 @@
                 <w:noProof/>
                 <w:webHidden/>
               </w:rPr>
-              <w:instrText>PAGEREF _Toc217309275 \h</w:instrText>
+              <w:instrText>PAGEREF _Toc224562850 \h</w:instrText>
             </w:r>
             <w:r>
               <w:rPr>
@@ -7926,7 +7926,7 @@
               <w14:ligatures w14:val="standardContextual"/>
             </w:rPr>
           </w:pPr>
-          <w:hyperlink w:anchor="_Toc217309276" w:history="1">
+          <w:hyperlink w:anchor="_Toc224562851" w:history="1">
             <w:r>
               <w:rPr>
                 <w:rStyle w:val="ae"/>
@@ -7964,7 +7964,7 @@
                 <w:noProof/>
                 <w:webHidden/>
               </w:rPr>
-              <w:instrText>PAGEREF _Toc217309276 \h</w:instrText>
+              <w:instrText>PAGEREF _Toc224562851 \h</w:instrText>
             </w:r>
             <w:r>
               <w:rPr>
@@ -8020,7 +8020,7 @@
               <w14:ligatures w14:val="standardContextual"/>
             </w:rPr>
           </w:pPr>
-          <w:hyperlink w:anchor="_Toc217309277" w:history="1">
+          <w:hyperlink w:anchor="_Toc224562852" w:history="1">
             <w:r>
               <w:rPr>
                 <w:rStyle w:val="ae"/>
@@ -8058,7 +8058,7 @@
                 <w:noProof/>
                 <w:webHidden/>
               </w:rPr>
-              <w:instrText>PAGEREF _Toc217309277 \h</w:instrText>
+              <w:instrText>PAGEREF _Toc224562852 \h</w:instrText>
             </w:r>
             <w:r>
               <w:rPr>
@@ -8114,7 +8114,7 @@
               <w14:ligatures w14:val="standardContextual"/>
             </w:rPr>
           </w:pPr>
-          <w:hyperlink w:anchor="_Toc217309278" w:history="1">
+          <w:hyperlink w:anchor="_Toc224562853" w:history="1">
             <w:r>
               <w:rPr>
                 <w:rStyle w:val="ae"/>
@@ -8160,7 +8160,7 @@
                 <w:noProof/>
                 <w:webHidden/>
               </w:rPr>
-              <w:instrText>PAGEREF _Toc217309278 \h</w:instrText>
+              <w:instrText>PAGEREF _Toc224562853 \h</w:instrText>
             </w:r>
             <w:r>
               <w:rPr>
@@ -8216,7 +8216,7 @@
               <w14:ligatures w14:val="standardContextual"/>
             </w:rPr>
           </w:pPr>
-          <w:hyperlink w:anchor="_Toc217309279" w:history="1">
+          <w:hyperlink w:anchor="_Toc224562854" w:history="1">
             <w:r>
               <w:rPr>
                 <w:rStyle w:val="ae"/>
@@ -8254,7 +8254,7 @@
                 <w:noProof/>
                 <w:webHidden/>
               </w:rPr>
-              <w:instrText>PAGEREF _Toc217309279 \h</w:instrText>
+              <w:instrText>PAGEREF _Toc224562854 \h</w:instrText>
             </w:r>
             <w:r>
               <w:rPr>
@@ -8310,7 +8310,7 @@
               <w14:ligatures w14:val="standardContextual"/>
             </w:rPr>
           </w:pPr>
-          <w:hyperlink w:anchor="_Toc217309280" w:history="1">
+          <w:hyperlink w:anchor="_Toc224562855" w:history="1">
             <w:r>
               <w:rPr>
                 <w:rStyle w:val="ae"/>
@@ -8348,7 +8348,7 @@
                 <w:noProof/>
                 <w:webHidden/>
               </w:rPr>
-              <w:instrText>PAGEREF _Toc217309280 \h</w:instrText>
+              <w:instrText>PAGEREF _Toc224562855 \h</w:instrText>
             </w:r>
             <w:r>
               <w:rPr>
@@ -8404,7 +8404,7 @@
               <w14:ligatures w14:val="standardContextual"/>
             </w:rPr>
           </w:pPr>
-          <w:hyperlink w:anchor="_Toc217309281" w:history="1">
+          <w:hyperlink w:anchor="_Toc224562856" w:history="1">
             <w:r>
               <w:rPr>
                 <w:rStyle w:val="ae"/>
@@ -8442,7 +8442,7 @@
                 <w:noProof/>
                 <w:webHidden/>
               </w:rPr>
-              <w:instrText>PAGEREF _Toc217309281 \h</w:instrText>
+              <w:instrText>PAGEREF _Toc224562856 \h</w:instrText>
             </w:r>
             <w:r>
               <w:rPr>
@@ -8498,7 +8498,7 @@
               <w14:ligatures w14:val="standardContextual"/>
             </w:rPr>
           </w:pPr>
-          <w:hyperlink w:anchor="_Toc217309282" w:history="1">
+          <w:hyperlink w:anchor="_Toc224562857" w:history="1">
             <w:r>
               <w:rPr>
                 <w:rStyle w:val="ae"/>
@@ -8536,7 +8536,7 @@
                 <w:noProof/>
                 <w:webHidden/>
               </w:rPr>
-              <w:instrText>PAGEREF _Toc217309282 \h</w:instrText>
+              <w:instrText>PAGEREF _Toc224562857 \h</w:instrText>
             </w:r>
             <w:r>
               <w:rPr>
@@ -8592,7 +8592,7 @@
               <w14:ligatures w14:val="standardContextual"/>
             </w:rPr>
           </w:pPr>
-          <w:hyperlink w:anchor="_Toc217309283" w:history="1">
+          <w:hyperlink w:anchor="_Toc224562858" w:history="1">
             <w:r>
               <w:rPr>
                 <w:rStyle w:val="ae"/>
@@ -8630,7 +8630,7 @@
                 <w:noProof/>
                 <w:webHidden/>
               </w:rPr>
-              <w:instrText>PAGEREF _Toc217309283 \h</w:instrText>
+              <w:instrText>PAGEREF _Toc224562858 \h</w:instrText>
             </w:r>
             <w:r>
               <w:rPr>
@@ -8686,7 +8686,7 @@
               <w14:ligatures w14:val="standardContextual"/>
             </w:rPr>
           </w:pPr>
-          <w:hyperlink w:anchor="_Toc217309284" w:history="1">
+          <w:hyperlink w:anchor="_Toc224562859" w:history="1">
             <w:r>
               <w:rPr>
                 <w:rStyle w:val="ae"/>
@@ -8724,7 +8724,7 @@
                 <w:noProof/>
                 <w:webHidden/>
               </w:rPr>
-              <w:instrText>PAGEREF _Toc217309284 \h</w:instrText>
+              <w:instrText>PAGEREF _Toc224562859 \h</w:instrText>
             </w:r>
             <w:r>
               <w:rPr>
@@ -8780,7 +8780,7 @@
               <w14:ligatures w14:val="standardContextual"/>
             </w:rPr>
           </w:pPr>
-          <w:hyperlink w:anchor="_Toc217309285" w:history="1">
+          <w:hyperlink w:anchor="_Toc224562860" w:history="1">
             <w:r>
               <w:rPr>
                 <w:rStyle w:val="ae"/>
@@ -8818,7 +8818,7 @@
                 <w:noProof/>
                 <w:webHidden/>
               </w:rPr>
-              <w:instrText>PAGEREF _Toc217309285 \h</w:instrText>
+              <w:instrText>PAGEREF _Toc224562860 \h</w:instrText>
             </w:r>
             <w:r>
               <w:rPr>
@@ -8874,7 +8874,7 @@
               <w14:ligatures w14:val="standardContextual"/>
             </w:rPr>
           </w:pPr>
-          <w:hyperlink w:anchor="_Toc217309286" w:history="1">
+          <w:hyperlink w:anchor="_Toc224562861" w:history="1">
             <w:r>
               <w:rPr>
                 <w:rStyle w:val="ae"/>
@@ -8912,7 +8912,7 @@
                 <w:noProof/>
                 <w:webHidden/>
               </w:rPr>
-              <w:instrText>PAGEREF _Toc217309286 \h</w:instrText>
+              <w:instrText>PAGEREF _Toc224562861 \h</w:instrText>
             </w:r>
             <w:r>
               <w:rPr>
@@ -8968,7 +8968,7 @@
               <w14:ligatures w14:val="standardContextual"/>
             </w:rPr>
           </w:pPr>
-          <w:hyperlink w:anchor="_Toc217309287" w:history="1">
+          <w:hyperlink w:anchor="_Toc224562862" w:history="1">
             <w:r>
               <w:rPr>
                 <w:rStyle w:val="ae"/>
@@ -9006,7 +9006,7 @@
                 <w:noProof/>
                 <w:webHidden/>
               </w:rPr>
-              <w:instrText>PAGEREF _Toc217309287 \h</w:instrText>
+              <w:instrText>PAGEREF _Toc224562862 \h</w:instrText>
             </w:r>
             <w:r>
               <w:rPr>
@@ -9062,7 +9062,7 @@
               <w14:ligatures w14:val="standardContextual"/>
             </w:rPr>
           </w:pPr>
-          <w:hyperlink w:anchor="_Toc217309288" w:history="1">
+          <w:hyperlink w:anchor="_Toc224562863" w:history="1">
             <w:r>
               <w:rPr>
                 <w:rStyle w:val="ae"/>
@@ -9100,7 +9100,7 @@
                 <w:noProof/>
                 <w:webHidden/>
               </w:rPr>
-              <w:instrText>PAGEREF _Toc217309288 \h</w:instrText>
+              <w:instrText>PAGEREF _Toc224562863 \h</w:instrText>
             </w:r>
             <w:r>
               <w:rPr>
@@ -9156,7 +9156,7 @@
               <w14:ligatures w14:val="standardContextual"/>
             </w:rPr>
           </w:pPr>
-          <w:hyperlink w:anchor="_Toc217309289" w:history="1">
+          <w:hyperlink w:anchor="_Toc224562864" w:history="1">
             <w:r>
               <w:rPr>
                 <w:rStyle w:val="ae"/>
@@ -9194,7 +9194,7 @@
                 <w:noProof/>
                 <w:webHidden/>
               </w:rPr>
-              <w:instrText>PAGEREF _Toc217309289 \h</w:instrText>
+              <w:instrText>PAGEREF _Toc224562864 \h</w:instrText>
             </w:r>
             <w:r>
               <w:rPr>
@@ -9250,7 +9250,7 @@
               <w14:ligatures w14:val="standardContextual"/>
             </w:rPr>
           </w:pPr>
-          <w:hyperlink w:anchor="_Toc217309290" w:history="1">
+          <w:hyperlink w:anchor="_Toc224562865" w:history="1">
             <w:r>
               <w:rPr>
                 <w:rStyle w:val="ae"/>
@@ -9288,7 +9288,7 @@
                 <w:noProof/>
                 <w:webHidden/>
               </w:rPr>
-              <w:instrText>PAGEREF _Toc217309290 \h</w:instrText>
+              <w:instrText>PAGEREF _Toc224562865 \h</w:instrText>
             </w:r>
             <w:r>
               <w:rPr>
@@ -9344,7 +9344,7 @@
               <w14:ligatures w14:val="standardContextual"/>
             </w:rPr>
           </w:pPr>
-          <w:hyperlink w:anchor="_Toc217309291" w:history="1">
+          <w:hyperlink w:anchor="_Toc224562866" w:history="1">
             <w:r>
               <w:rPr>
                 <w:rStyle w:val="ae"/>
@@ -9382,7 +9382,7 @@
                 <w:noProof/>
                 <w:webHidden/>
               </w:rPr>
-              <w:instrText>PAGEREF _Toc217309291 \h</w:instrText>
+              <w:instrText>PAGEREF _Toc224562866 \h</w:instrText>
             </w:r>
             <w:r>
               <w:rPr>
@@ -9438,7 +9438,7 @@
               <w14:ligatures w14:val="standardContextual"/>
             </w:rPr>
           </w:pPr>
-          <w:hyperlink w:anchor="_Toc217309292" w:history="1">
+          <w:hyperlink w:anchor="_Toc224562867" w:history="1">
             <w:r>
               <w:rPr>
                 <w:rStyle w:val="ae"/>
@@ -9476,7 +9476,7 @@
                 <w:noProof/>
                 <w:webHidden/>
               </w:rPr>
-              <w:instrText>PAGEREF _Toc217309292 \h</w:instrText>
+              <w:instrText>PAGEREF _Toc224562867 \h</w:instrText>
             </w:r>
             <w:r>
               <w:rPr>
@@ -9532,7 +9532,7 @@
               <w14:ligatures w14:val="standardContextual"/>
             </w:rPr>
           </w:pPr>
-          <w:hyperlink w:anchor="_Toc217309293" w:history="1">
+          <w:hyperlink w:anchor="_Toc224562868" w:history="1">
             <w:r>
               <w:rPr>
                 <w:rStyle w:val="ae"/>
@@ -9578,7 +9578,7 @@
                 <w:noProof/>
                 <w:webHidden/>
               </w:rPr>
-              <w:instrText>PAGEREF _Toc217309293 \h</w:instrText>
+              <w:instrText>PAGEREF _Toc224562868 \h</w:instrText>
             </w:r>
             <w:r>
               <w:rPr>
@@ -9634,7 +9634,7 @@
               <w14:ligatures w14:val="standardContextual"/>
             </w:rPr>
           </w:pPr>
-          <w:hyperlink w:anchor="_Toc217309294" w:history="1">
+          <w:hyperlink w:anchor="_Toc224562869" w:history="1">
             <w:r>
               <w:rPr>
                 <w:rStyle w:val="ae"/>
@@ -9672,7 +9672,7 @@
                 <w:noProof/>
                 <w:webHidden/>
               </w:rPr>
-              <w:instrText>PAGEREF _Toc217309294 \h</w:instrText>
+              <w:instrText>PAGEREF _Toc224562869 \h</w:instrText>
             </w:r>
             <w:r>
               <w:rPr>
@@ -9728,7 +9728,7 @@
               <w14:ligatures w14:val="standardContextual"/>
             </w:rPr>
           </w:pPr>
-          <w:hyperlink w:anchor="_Toc217309295" w:history="1">
+          <w:hyperlink w:anchor="_Toc224562870" w:history="1">
             <w:r>
               <w:rPr>
                 <w:rStyle w:val="ae"/>
@@ -9766,7 +9766,7 @@
                 <w:noProof/>
                 <w:webHidden/>
               </w:rPr>
-              <w:instrText>PAGEREF _Toc217309295 \h</w:instrText>
+              <w:instrText>PAGEREF _Toc224562870 \h</w:instrText>
             </w:r>
             <w:r>
               <w:rPr>
@@ -9822,7 +9822,7 @@
               <w14:ligatures w14:val="standardContextual"/>
             </w:rPr>
           </w:pPr>
-          <w:hyperlink w:anchor="_Toc217309296" w:history="1">
+          <w:hyperlink w:anchor="_Toc224562871" w:history="1">
             <w:r>
               <w:rPr>
                 <w:rStyle w:val="ae"/>
@@ -9860,7 +9860,7 @@
                 <w:noProof/>
                 <w:webHidden/>
               </w:rPr>
-              <w:instrText>PAGEREF _Toc217309296 \h</w:instrText>
+              <w:instrText>PAGEREF _Toc224562871 \h</w:instrText>
             </w:r>
             <w:r>
               <w:rPr>
@@ -9916,7 +9916,7 @@
               <w14:ligatures w14:val="standardContextual"/>
             </w:rPr>
           </w:pPr>
-          <w:hyperlink w:anchor="_Toc217309297" w:history="1">
+          <w:hyperlink w:anchor="_Toc224562872" w:history="1">
             <w:r>
               <w:rPr>
                 <w:rStyle w:val="ae"/>
@@ -9954,7 +9954,7 @@
                 <w:noProof/>
                 <w:webHidden/>
               </w:rPr>
-              <w:instrText>PAGEREF _Toc217309297 \h</w:instrText>
+              <w:instrText>PAGEREF _Toc224562872 \h</w:instrText>
             </w:r>
             <w:r>
               <w:rPr>
@@ -10010,7 +10010,7 @@
               <w14:ligatures w14:val="standardContextual"/>
             </w:rPr>
           </w:pPr>
-          <w:hyperlink w:anchor="_Toc217309298" w:history="1">
+          <w:hyperlink w:anchor="_Toc224562873" w:history="1">
             <w:r>
               <w:rPr>
                 <w:rStyle w:val="ae"/>
@@ -10048,7 +10048,7 @@
                 <w:noProof/>
                 <w:webHidden/>
               </w:rPr>
-              <w:instrText>PAGEREF _Toc217309298 \h</w:instrText>
+              <w:instrText>PAGEREF _Toc224562873 \h</w:instrText>
             </w:r>
             <w:r>
               <w:rPr>
@@ -10104,7 +10104,7 @@
               <w14:ligatures w14:val="standardContextual"/>
             </w:rPr>
           </w:pPr>
-          <w:hyperlink w:anchor="_Toc217309299" w:history="1">
+          <w:hyperlink w:anchor="_Toc224562874" w:history="1">
             <w:r>
               <w:rPr>
                 <w:rStyle w:val="ae"/>
@@ -10142,7 +10142,7 @@
                 <w:noProof/>
                 <w:webHidden/>
               </w:rPr>
-              <w:instrText>PAGEREF _Toc217309299 \h</w:instrText>
+              <w:instrText>PAGEREF _Toc224562874 \h</w:instrText>
             </w:r>
             <w:r>
               <w:rPr>
@@ -10198,7 +10198,7 @@
               <w14:ligatures w14:val="standardContextual"/>
             </w:rPr>
           </w:pPr>
-          <w:hyperlink w:anchor="_Toc217309300" w:history="1">
+          <w:hyperlink w:anchor="_Toc224562875" w:history="1">
             <w:r>
               <w:rPr>
                 <w:rStyle w:val="ae"/>
@@ -10236,7 +10236,7 @@
                 <w:noProof/>
                 <w:webHidden/>
               </w:rPr>
-              <w:instrText>PAGEREF _Toc217309300 \h</w:instrText>
+              <w:instrText>PAGEREF _Toc224562875 \h</w:instrText>
             </w:r>
             <w:r>
               <w:rPr>
@@ -10292,7 +10292,7 @@
               <w14:ligatures w14:val="standardContextual"/>
             </w:rPr>
           </w:pPr>
-          <w:hyperlink w:anchor="_Toc217309301" w:history="1">
+          <w:hyperlink w:anchor="_Toc224562876" w:history="1">
             <w:r>
               <w:rPr>
                 <w:rStyle w:val="ae"/>
@@ -10330,7 +10330,7 @@
                 <w:noProof/>
                 <w:webHidden/>
               </w:rPr>
-              <w:instrText>PAGEREF _Toc217309301 \h</w:instrText>
+              <w:instrText>PAGEREF _Toc224562876 \h</w:instrText>
             </w:r>
             <w:r>
               <w:rPr>
@@ -10386,7 +10386,7 @@
               <w14:ligatures w14:val="standardContextual"/>
             </w:rPr>
           </w:pPr>
-          <w:hyperlink w:anchor="_Toc217309302" w:history="1">
+          <w:hyperlink w:anchor="_Toc224562877" w:history="1">
             <w:r>
               <w:rPr>
                 <w:rStyle w:val="ae"/>
@@ -10424,7 +10424,7 @@
                 <w:noProof/>
                 <w:webHidden/>
               </w:rPr>
-              <w:instrText>PAGEREF _Toc217309302 \h</w:instrText>
+              <w:instrText>PAGEREF _Toc224562877 \h</w:instrText>
             </w:r>
             <w:r>
               <w:rPr>
@@ -10480,7 +10480,7 @@
               <w14:ligatures w14:val="standardContextual"/>
             </w:rPr>
           </w:pPr>
-          <w:hyperlink w:anchor="_Toc217309303" w:history="1">
+          <w:hyperlink w:anchor="_Toc224562878" w:history="1">
             <w:r>
               <w:rPr>
                 <w:rStyle w:val="ae"/>
@@ -10518,7 +10518,7 @@
                 <w:noProof/>
                 <w:webHidden/>
               </w:rPr>
-              <w:instrText>PAGEREF _Toc217309303 \h</w:instrText>
+              <w:instrText>PAGEREF _Toc224562878 \h</w:instrText>
             </w:r>
             <w:r>
               <w:rPr>
@@ -10575,7 +10575,7 @@
               <w14:ligatures w14:val="standardContextual"/>
             </w:rPr>
           </w:pPr>
-          <w:hyperlink w:anchor="_Toc217309304" w:history="1">
+          <w:hyperlink w:anchor="_Toc224562879" w:history="1">
             <w:r>
               <w:rPr>
                 <w:rStyle w:val="ae"/>
@@ -10631,7 +10631,7 @@
                 <w:noProof/>
                 <w:webHidden/>
               </w:rPr>
-              <w:instrText>PAGEREF _Toc217309304 \h</w:instrText>
+              <w:instrText>PAGEREF _Toc224562879 \h</w:instrText>
             </w:r>
             <w:r>
               <w:rPr>
@@ -10687,7 +10687,7 @@
               <w14:ligatures w14:val="standardContextual"/>
             </w:rPr>
           </w:pPr>
-          <w:hyperlink w:anchor="_Toc217309305" w:history="1">
+          <w:hyperlink w:anchor="_Toc224562880" w:history="1">
             <w:r>
               <w:rPr>
                 <w:rStyle w:val="ae"/>
@@ -10725,7 +10725,7 @@
                 <w:noProof/>
                 <w:webHidden/>
               </w:rPr>
-              <w:instrText>PAGEREF _Toc217309305 \h</w:instrText>
+              <w:instrText>PAGEREF _Toc224562880 \h</w:instrText>
             </w:r>
             <w:r>
               <w:rPr>
@@ -10781,7 +10781,7 @@
               <w14:ligatures w14:val="standardContextual"/>
             </w:rPr>
           </w:pPr>
-          <w:hyperlink w:anchor="_Toc217309306" w:history="1">
+          <w:hyperlink w:anchor="_Toc224562881" w:history="1">
             <w:r>
               <w:rPr>
                 <w:rStyle w:val="ae"/>
@@ -10819,7 +10819,7 @@
                 <w:noProof/>
                 <w:webHidden/>
               </w:rPr>
-              <w:instrText>PAGEREF _Toc217309306 \h</w:instrText>
+              <w:instrText>PAGEREF _Toc224562881 \h</w:instrText>
             </w:r>
             <w:r>
               <w:rPr>
@@ -10875,7 +10875,7 @@
               <w14:ligatures w14:val="standardContextual"/>
             </w:rPr>
           </w:pPr>
-          <w:hyperlink w:anchor="_Toc217309307" w:history="1">
+          <w:hyperlink w:anchor="_Toc224562882" w:history="1">
             <w:r>
               <w:rPr>
                 <w:rStyle w:val="ae"/>
@@ -10913,7 +10913,7 @@
                 <w:noProof/>
                 <w:webHidden/>
               </w:rPr>
-              <w:instrText>PAGEREF _Toc217309307 \h</w:instrText>
+              <w:instrText>PAGEREF _Toc224562882 \h</w:instrText>
             </w:r>
             <w:r>
               <w:rPr>
@@ -10969,7 +10969,7 @@
               <w14:ligatures w14:val="standardContextual"/>
             </w:rPr>
           </w:pPr>
-          <w:hyperlink w:anchor="_Toc217309308" w:history="1">
+          <w:hyperlink w:anchor="_Toc224562883" w:history="1">
             <w:r>
               <w:rPr>
                 <w:rStyle w:val="ae"/>
@@ -11007,7 +11007,7 @@
                 <w:noProof/>
                 <w:webHidden/>
               </w:rPr>
-              <w:instrText>PAGEREF _Toc217309308 \h</w:instrText>
+              <w:instrText>PAGEREF _Toc224562883 \h</w:instrText>
             </w:r>
             <w:r>
               <w:rPr>
@@ -11063,7 +11063,7 @@
               <w14:ligatures w14:val="standardContextual"/>
             </w:rPr>
           </w:pPr>
-          <w:hyperlink w:anchor="_Toc217309309" w:history="1">
+          <w:hyperlink w:anchor="_Toc224562884" w:history="1">
             <w:r>
               <w:rPr>
                 <w:rStyle w:val="ae"/>
@@ -11101,7 +11101,7 @@
                 <w:noProof/>
                 <w:webHidden/>
               </w:rPr>
-              <w:instrText>PAGEREF _Toc217309309 \h</w:instrText>
+              <w:instrText>PAGEREF _Toc224562884 \h</w:instrText>
             </w:r>
             <w:r>
               <w:rPr>
@@ -11162,13 +11162,7 @@
     <w:p/>
     <w:p/>
     <w:p/>
-    <w:p>
-      <w:pPr>
-        <w:rPr>
-          <w:rFonts w:hint="eastAsia"/>
-        </w:rPr>
-      </w:pPr>
-    </w:p>
+    <w:p/>
     <w:tbl>
       <w:tblPr>
         <w:tblW w:w="8347" w:type="dxa"/>
@@ -11404,7 +11398,7 @@
               <w:rPr>
                 <w:rFonts w:hint="eastAsia"/>
               </w:rPr>
-              <w:t>20</w:t>
+              <w:t>22</w:t>
             </w:r>
             <w:r>
               <w:rPr>
@@ -11494,7 +11488,13 @@
               <w:rPr>
                 <w:rFonts w:hint="eastAsia"/>
               </w:rPr>
-              <w:t>2025</w:t>
+              <w:t>202</w:t>
+            </w:r>
+            <w:r>
+              <w:rPr>
+                <w:rFonts w:hint="eastAsia"/>
+              </w:rPr>
+              <w:t>6</w:t>
             </w:r>
             <w:r>
               <w:t>-</w:t>
@@ -11503,7 +11503,7 @@
               <w:rPr>
                 <w:rFonts w:hint="eastAsia"/>
               </w:rPr>
-              <w:t>12</w:t>
+              <w:t>03</w:t>
             </w:r>
             <w:r>
               <w:t>-</w:t>
@@ -11512,7 +11512,7 @@
               <w:rPr>
                 <w:rFonts w:hint="eastAsia"/>
               </w:rPr>
-              <w:t>23</w:t>
+              <w:t>16</w:t>
             </w:r>
           </w:p>
         </w:tc>
@@ -11603,7 +11603,7 @@
       <w:pPr>
         <w:pStyle w:val="1"/>
       </w:pPr>
-      <w:bookmarkStart w:id="1" w:name="_Toc217309194"/>
+      <w:bookmarkStart w:id="1" w:name="_Toc224562769"/>
       <w:r>
         <w:rPr>
           <w:rFonts w:hint="eastAsia"/>
@@ -11617,7 +11617,7 @@
       <w:pPr>
         <w:pStyle w:val="2"/>
       </w:pPr>
-      <w:bookmarkStart w:id="2" w:name="_Toc217309195"/>
+      <w:bookmarkStart w:id="2" w:name="_Toc224562770"/>
       <w:r>
         <w:rPr>
           <w:rFonts w:hint="eastAsia"/>
@@ -11647,7 +11647,7 @@
       <w:pPr>
         <w:pStyle w:val="2"/>
       </w:pPr>
-      <w:bookmarkStart w:id="3" w:name="_Toc217309196"/>
+      <w:bookmarkStart w:id="3" w:name="_Toc224562771"/>
       <w:r>
         <w:rPr>
           <w:rFonts w:hint="eastAsia"/>
@@ -11668,7 +11668,7 @@
       <w:pPr>
         <w:pStyle w:val="2"/>
       </w:pPr>
-      <w:bookmarkStart w:id="4" w:name="_Toc217309197"/>
+      <w:bookmarkStart w:id="4" w:name="_Toc224562772"/>
       <w:r>
         <w:rPr>
           <w:rFonts w:hint="eastAsia"/>
@@ -11693,7 +11693,7 @@
         <w:pStyle w:val="1"/>
       </w:pPr>
       <w:bookmarkStart w:id="5" w:name="_Toc18055"/>
-      <w:bookmarkStart w:id="6" w:name="_Toc217309198"/>
+      <w:bookmarkStart w:id="6" w:name="_Toc224562773"/>
       <w:r>
         <w:rPr>
           <w:rFonts w:hint="eastAsia"/>
@@ -11745,7 +11745,7 @@
           <w:numId w:val="1"/>
         </w:numPr>
       </w:pPr>
-      <w:bookmarkStart w:id="7" w:name="_Toc217309199"/>
+      <w:bookmarkStart w:id="7" w:name="_Toc224562774"/>
       <w:r>
         <w:rPr>
           <w:rFonts w:hint="eastAsia"/>
@@ -11840,7 +11840,7 @@
       <w:pPr>
         <w:pStyle w:val="2"/>
       </w:pPr>
-      <w:bookmarkStart w:id="8" w:name="_Toc217309200"/>
+      <w:bookmarkStart w:id="8" w:name="_Toc224562775"/>
       <w:r>
         <w:rPr>
           <w:rFonts w:hint="eastAsia"/>
@@ -11899,7 +11899,7 @@
       <w:pPr>
         <w:pStyle w:val="2"/>
       </w:pPr>
-      <w:bookmarkStart w:id="9" w:name="_Toc217309201"/>
+      <w:bookmarkStart w:id="9" w:name="_Toc224562776"/>
       <w:r>
         <w:rPr>
           <w:rFonts w:hint="eastAsia"/>
@@ -12000,7 +12000,7 @@
       <w:pPr>
         <w:pStyle w:val="2"/>
       </w:pPr>
-      <w:bookmarkStart w:id="10" w:name="_Toc217309202"/>
+      <w:bookmarkStart w:id="10" w:name="_Toc224562777"/>
       <w:r>
         <w:rPr>
           <w:rFonts w:hint="eastAsia"/>
@@ -12021,7 +12021,7 @@
       <w:pPr>
         <w:pStyle w:val="2"/>
       </w:pPr>
-      <w:bookmarkStart w:id="11" w:name="_Toc217309203"/>
+      <w:bookmarkStart w:id="11" w:name="_Toc224562778"/>
       <w:r>
         <w:rPr>
           <w:rFonts w:hint="eastAsia"/>
@@ -12042,7 +12042,7 @@
       <w:pPr>
         <w:pStyle w:val="2"/>
       </w:pPr>
-      <w:bookmarkStart w:id="12" w:name="_Toc217309204"/>
+      <w:bookmarkStart w:id="12" w:name="_Toc224562779"/>
       <w:r>
         <w:rPr>
           <w:rFonts w:hint="eastAsia"/>
@@ -12063,7 +12063,7 @@
       <w:pPr>
         <w:pStyle w:val="2"/>
       </w:pPr>
-      <w:bookmarkStart w:id="13" w:name="_Toc217309205"/>
+      <w:bookmarkStart w:id="13" w:name="_Toc224562780"/>
       <w:r>
         <w:rPr>
           <w:rFonts w:hint="eastAsia"/>
@@ -12088,7 +12088,7 @@
         <w:pStyle w:val="1"/>
       </w:pPr>
       <w:bookmarkStart w:id="14" w:name="_Toc25592"/>
-      <w:bookmarkStart w:id="15" w:name="_Toc217309206"/>
+      <w:bookmarkStart w:id="15" w:name="_Toc224562781"/>
       <w:r>
         <w:rPr>
           <w:rFonts w:hint="eastAsia"/>
@@ -12116,7 +12116,7 @@
         <w:pStyle w:val="2"/>
       </w:pPr>
       <w:bookmarkStart w:id="16" w:name="_Toc20809"/>
-      <w:bookmarkStart w:id="17" w:name="_Toc217309207"/>
+      <w:bookmarkStart w:id="17" w:name="_Toc224562782"/>
       <w:r>
         <w:rPr>
           <w:rFonts w:hint="eastAsia"/>
@@ -12153,7 +12153,7 @@
         <w:pStyle w:val="3"/>
       </w:pPr>
       <w:bookmarkStart w:id="18" w:name="_Toc31502"/>
-      <w:bookmarkStart w:id="19" w:name="_Toc217309208"/>
+      <w:bookmarkStart w:id="19" w:name="_Toc224562783"/>
       <w:r>
         <w:rPr>
           <w:rFonts w:hint="eastAsia"/>
@@ -12182,7 +12182,7 @@
         <w:pStyle w:val="3"/>
       </w:pPr>
       <w:bookmarkStart w:id="20" w:name="_Toc13573"/>
-      <w:bookmarkStart w:id="21" w:name="_Toc217309209"/>
+      <w:bookmarkStart w:id="21" w:name="_Toc224562784"/>
       <w:r>
         <w:rPr>
           <w:rFonts w:hint="eastAsia"/>
@@ -12235,7 +12235,7 @@
       <w:pPr>
         <w:pStyle w:val="2"/>
       </w:pPr>
-      <w:bookmarkStart w:id="23" w:name="_Toc217309210"/>
+      <w:bookmarkStart w:id="23" w:name="_Toc224562785"/>
       <w:r>
         <w:rPr>
           <w:rFonts w:hint="eastAsia"/>
@@ -12267,7 +12267,7 @@
         <w:pStyle w:val="2"/>
       </w:pPr>
       <w:bookmarkStart w:id="24" w:name="_Toc18062"/>
-      <w:bookmarkStart w:id="25" w:name="_Toc217309211"/>
+      <w:bookmarkStart w:id="25" w:name="_Toc224562786"/>
       <w:r>
         <w:rPr>
           <w:rFonts w:hint="eastAsia"/>
@@ -12298,7 +12298,7 @@
       <w:pPr>
         <w:pStyle w:val="2"/>
       </w:pPr>
-      <w:bookmarkStart w:id="26" w:name="_Toc217309212"/>
+      <w:bookmarkStart w:id="26" w:name="_Toc224562787"/>
       <w:r>
         <w:rPr>
           <w:rFonts w:hint="eastAsia"/>
@@ -12312,7 +12312,7 @@
         <w:pStyle w:val="1"/>
       </w:pPr>
       <w:bookmarkStart w:id="27" w:name="_Toc6830"/>
-      <w:bookmarkStart w:id="28" w:name="_Toc217309213"/>
+      <w:bookmarkStart w:id="28" w:name="_Toc224562788"/>
       <w:r>
         <w:rPr>
           <w:rFonts w:hint="eastAsia"/>
@@ -12392,7 +12392,7 @@
       </w:pPr>
       <w:bookmarkStart w:id="29" w:name="_Toc5244"/>
       <w:bookmarkStart w:id="30" w:name="_Toc3496"/>
-      <w:bookmarkStart w:id="31" w:name="_Toc217309214"/>
+      <w:bookmarkStart w:id="31" w:name="_Toc224562789"/>
       <w:r>
         <w:rPr>
           <w:rFonts w:hint="eastAsia"/>
@@ -12450,7 +12450,7 @@
         <w:pStyle w:val="3"/>
       </w:pPr>
       <w:bookmarkStart w:id="32" w:name="_Toc13337"/>
-      <w:bookmarkStart w:id="33" w:name="_Toc217309215"/>
+      <w:bookmarkStart w:id="33" w:name="_Toc224562790"/>
       <w:r>
         <w:rPr>
           <w:rFonts w:hint="eastAsia"/>
@@ -13830,7 +13830,7 @@
       <w:pPr>
         <w:pStyle w:val="3"/>
       </w:pPr>
-      <w:bookmarkStart w:id="35" w:name="_Toc217309216"/>
+      <w:bookmarkStart w:id="35" w:name="_Toc224562791"/>
       <w:r>
         <w:rPr>
           <w:rFonts w:hint="eastAsia"/>
@@ -14273,7 +14273,7 @@
       </w:pPr>
       <w:bookmarkStart w:id="36" w:name="_Toc12158"/>
       <w:bookmarkStart w:id="37" w:name="_Toc8616"/>
-      <w:bookmarkStart w:id="38" w:name="_Toc217309217"/>
+      <w:bookmarkStart w:id="38" w:name="_Toc224562792"/>
       <w:r>
         <w:rPr>
           <w:rFonts w:hint="eastAsia"/>
@@ -14696,7 +14696,7 @@
         <w:pStyle w:val="1"/>
       </w:pPr>
       <w:bookmarkStart w:id="39" w:name="_Toc25275"/>
-      <w:bookmarkStart w:id="40" w:name="_Toc217309218"/>
+      <w:bookmarkStart w:id="40" w:name="_Toc224562793"/>
       <w:r>
         <w:rPr>
           <w:rFonts w:hint="eastAsia"/>
@@ -14763,7 +14763,7 @@
       <w:pPr>
         <w:pStyle w:val="2"/>
       </w:pPr>
-      <w:bookmarkStart w:id="41" w:name="_Toc217309219"/>
+      <w:bookmarkStart w:id="41" w:name="_Toc224562794"/>
       <w:r>
         <w:rPr>
           <w:rFonts w:hint="eastAsia"/>
@@ -14787,7 +14787,7 @@
       <w:pPr>
         <w:pStyle w:val="3"/>
       </w:pPr>
-      <w:bookmarkStart w:id="42" w:name="_Toc217309220"/>
+      <w:bookmarkStart w:id="42" w:name="_Toc224562795"/>
       <w:r>
         <w:rPr>
           <w:rFonts w:hint="eastAsia"/>
@@ -14885,7 +14885,7 @@
       <w:pPr>
         <w:pStyle w:val="3"/>
       </w:pPr>
-      <w:bookmarkStart w:id="43" w:name="_Toc217309221"/>
+      <w:bookmarkStart w:id="43" w:name="_Toc224562796"/>
       <w:r>
         <w:rPr>
           <w:rFonts w:hint="eastAsia"/>
@@ -15243,7 +15243,7 @@
       <w:pPr>
         <w:pStyle w:val="1"/>
       </w:pPr>
-      <w:bookmarkStart w:id="44" w:name="_Toc217309222"/>
+      <w:bookmarkStart w:id="44" w:name="_Toc224562797"/>
       <w:r>
         <w:rPr>
           <w:rFonts w:hint="eastAsia"/>
@@ -15282,7 +15282,7 @@
       <w:pPr>
         <w:pStyle w:val="2"/>
       </w:pPr>
-      <w:bookmarkStart w:id="45" w:name="_Toc217309223"/>
+      <w:bookmarkStart w:id="45" w:name="_Toc224562798"/>
       <w:r>
         <w:rPr>
           <w:rFonts w:hint="eastAsia"/>
@@ -15326,7 +15326,7 @@
       <w:pPr>
         <w:pStyle w:val="3"/>
       </w:pPr>
-      <w:bookmarkStart w:id="46" w:name="_Toc217309224"/>
+      <w:bookmarkStart w:id="46" w:name="_Toc224562799"/>
       <w:r>
         <w:rPr>
           <w:rFonts w:hint="eastAsia"/>
@@ -15575,7 +15575,7 @@
       <w:pPr>
         <w:pStyle w:val="3"/>
       </w:pPr>
-      <w:bookmarkStart w:id="47" w:name="_Toc217309225"/>
+      <w:bookmarkStart w:id="47" w:name="_Toc224562800"/>
       <w:r>
         <w:rPr>
           <w:rFonts w:hint="eastAsia"/>
@@ -15798,7 +15798,7 @@
       <w:pPr>
         <w:pStyle w:val="3"/>
       </w:pPr>
-      <w:bookmarkStart w:id="48" w:name="_Toc217309226"/>
+      <w:bookmarkStart w:id="48" w:name="_Toc224562801"/>
       <w:r>
         <w:rPr>
           <w:rFonts w:hint="eastAsia"/>
@@ -15931,7 +15931,7 @@
       <w:pPr>
         <w:pStyle w:val="3"/>
       </w:pPr>
-      <w:bookmarkStart w:id="49" w:name="_Toc217309227"/>
+      <w:bookmarkStart w:id="49" w:name="_Toc224562802"/>
       <w:r>
         <w:rPr>
           <w:rFonts w:hint="eastAsia"/>
@@ -16159,7 +16159,7 @@
       <w:pPr>
         <w:pStyle w:val="3"/>
       </w:pPr>
-      <w:bookmarkStart w:id="50" w:name="_Toc217309228"/>
+      <w:bookmarkStart w:id="50" w:name="_Toc224562803"/>
       <w:r>
         <w:rPr>
           <w:rFonts w:hint="eastAsia"/>
@@ -16298,7 +16298,7 @@
       <w:pPr>
         <w:pStyle w:val="2"/>
       </w:pPr>
-      <w:bookmarkStart w:id="51" w:name="_Toc217309229"/>
+      <w:bookmarkStart w:id="51" w:name="_Toc224562804"/>
       <w:r>
         <w:rPr>
           <w:rFonts w:hint="eastAsia"/>
@@ -16320,7 +16320,7 @@
       <w:pPr>
         <w:pStyle w:val="3"/>
       </w:pPr>
-      <w:bookmarkStart w:id="52" w:name="_Toc217309230"/>
+      <w:bookmarkStart w:id="52" w:name="_Toc224562805"/>
       <w:r>
         <w:rPr>
           <w:rFonts w:hint="eastAsia"/>
@@ -16512,7 +16512,7 @@
       <w:pPr>
         <w:pStyle w:val="3"/>
       </w:pPr>
-      <w:bookmarkStart w:id="53" w:name="_Toc217309231"/>
+      <w:bookmarkStart w:id="53" w:name="_Toc224562806"/>
       <w:r>
         <w:rPr>
           <w:rFonts w:hint="eastAsia"/>
@@ -16827,7 +16827,7 @@
       <w:pPr>
         <w:pStyle w:val="3"/>
       </w:pPr>
-      <w:bookmarkStart w:id="54" w:name="_Toc217309232"/>
+      <w:bookmarkStart w:id="54" w:name="_Toc224562807"/>
       <w:r>
         <w:rPr>
           <w:rFonts w:hint="eastAsia"/>
@@ -16962,7 +16962,7 @@
         <w:pStyle w:val="2"/>
       </w:pPr>
       <w:bookmarkStart w:id="55" w:name="_Toc3046"/>
-      <w:bookmarkStart w:id="56" w:name="_Toc217309233"/>
+      <w:bookmarkStart w:id="56" w:name="_Toc224562808"/>
       <w:r>
         <w:rPr>
           <w:rFonts w:hint="eastAsia"/>
@@ -16994,7 +16994,7 @@
         <w:pStyle w:val="3"/>
       </w:pPr>
       <w:bookmarkStart w:id="57" w:name="_Toc3626"/>
-      <w:bookmarkStart w:id="58" w:name="_Toc217309234"/>
+      <w:bookmarkStart w:id="58" w:name="_Toc224562809"/>
       <w:r>
         <w:rPr>
           <w:rFonts w:hint="eastAsia"/>
@@ -17214,7 +17214,7 @@
         <w:pStyle w:val="3"/>
       </w:pPr>
       <w:bookmarkStart w:id="59" w:name="_Toc25476"/>
-      <w:bookmarkStart w:id="60" w:name="_Toc217309235"/>
+      <w:bookmarkStart w:id="60" w:name="_Toc224562810"/>
       <w:r>
         <w:rPr>
           <w:rFonts w:hint="eastAsia"/>
@@ -17537,7 +17537,7 @@
         <w:pStyle w:val="3"/>
       </w:pPr>
       <w:bookmarkStart w:id="61" w:name="_Toc26360"/>
-      <w:bookmarkStart w:id="62" w:name="_Toc217309236"/>
+      <w:bookmarkStart w:id="62" w:name="_Toc224562811"/>
       <w:r>
         <w:rPr>
           <w:rFonts w:hint="eastAsia"/>
@@ -17716,7 +17716,7 @@
       </w:pPr>
       <w:bookmarkStart w:id="63" w:name="_Toc19019"/>
       <w:bookmarkStart w:id="64" w:name="_Toc11956"/>
-      <w:bookmarkStart w:id="65" w:name="_Toc217309237"/>
+      <w:bookmarkStart w:id="65" w:name="_Toc224562812"/>
       <w:r>
         <w:rPr>
           <w:rFonts w:hint="eastAsia"/>
@@ -17884,7 +17884,7 @@
         <w:pStyle w:val="3"/>
       </w:pPr>
       <w:bookmarkStart w:id="66" w:name="_Toc4095"/>
-      <w:bookmarkStart w:id="67" w:name="_Toc217309238"/>
+      <w:bookmarkStart w:id="67" w:name="_Toc224562813"/>
       <w:bookmarkEnd w:id="64"/>
       <w:r>
         <w:rPr>
@@ -18052,7 +18052,7 @@
       <w:pPr>
         <w:pStyle w:val="3"/>
       </w:pPr>
-      <w:bookmarkStart w:id="68" w:name="_Toc217309239"/>
+      <w:bookmarkStart w:id="68" w:name="_Toc224562814"/>
       <w:r>
         <w:rPr>
           <w:rFonts w:hint="eastAsia"/>
@@ -18273,7 +18273,7 @@
         <w:pStyle w:val="2"/>
       </w:pPr>
       <w:bookmarkStart w:id="69" w:name="_Toc21366"/>
-      <w:bookmarkStart w:id="70" w:name="_Toc217309240"/>
+      <w:bookmarkStart w:id="70" w:name="_Toc224562815"/>
       <w:r>
         <w:rPr>
           <w:rFonts w:hint="eastAsia"/>
@@ -18306,7 +18306,7 @@
         <w:pStyle w:val="3"/>
       </w:pPr>
       <w:bookmarkStart w:id="71" w:name="_Toc23097"/>
-      <w:bookmarkStart w:id="72" w:name="_Toc217309241"/>
+      <w:bookmarkStart w:id="72" w:name="_Toc224562816"/>
       <w:r>
         <w:rPr>
           <w:rFonts w:hint="eastAsia"/>
@@ -18455,7 +18455,7 @@
         <w:pStyle w:val="3"/>
       </w:pPr>
       <w:bookmarkStart w:id="73" w:name="_Toc31977"/>
-      <w:bookmarkStart w:id="74" w:name="_Toc217309242"/>
+      <w:bookmarkStart w:id="74" w:name="_Toc224562817"/>
       <w:r>
         <w:rPr>
           <w:rFonts w:hint="eastAsia"/>
@@ -18588,7 +18588,7 @@
       <w:pPr>
         <w:pStyle w:val="3"/>
       </w:pPr>
-      <w:bookmarkStart w:id="75" w:name="_Toc217309243"/>
+      <w:bookmarkStart w:id="75" w:name="_Toc224562818"/>
       <w:r>
         <w:rPr>
           <w:rFonts w:hint="eastAsia"/>
@@ -18680,7 +18680,7 @@
       <w:pPr>
         <w:pStyle w:val="2"/>
       </w:pPr>
-      <w:bookmarkStart w:id="76" w:name="_Toc217309244"/>
+      <w:bookmarkStart w:id="76" w:name="_Toc224562819"/>
       <w:r>
         <w:rPr>
           <w:rFonts w:hint="eastAsia"/>
@@ -18704,7 +18704,7 @@
       <w:pPr>
         <w:pStyle w:val="3"/>
       </w:pPr>
-      <w:bookmarkStart w:id="77" w:name="_Toc217309245"/>
+      <w:bookmarkStart w:id="77" w:name="_Toc224562820"/>
       <w:r>
         <w:rPr>
           <w:rFonts w:hint="eastAsia"/>
@@ -18922,7 +18922,7 @@
       <w:pPr>
         <w:pStyle w:val="3"/>
       </w:pPr>
-      <w:bookmarkStart w:id="78" w:name="_Toc217309246"/>
+      <w:bookmarkStart w:id="78" w:name="_Toc224562821"/>
       <w:r>
         <w:rPr>
           <w:rFonts w:hint="eastAsia"/>
@@ -19150,7 +19150,7 @@
       <w:pPr>
         <w:pStyle w:val="2"/>
       </w:pPr>
-      <w:bookmarkStart w:id="79" w:name="_Toc217309247"/>
+      <w:bookmarkStart w:id="79" w:name="_Toc224562822"/>
       <w:r>
         <w:rPr>
           <w:rFonts w:hint="eastAsia"/>
@@ -19171,7 +19171,7 @@
       <w:pPr>
         <w:pStyle w:val="3"/>
       </w:pPr>
-      <w:bookmarkStart w:id="80" w:name="_Toc217309248"/>
+      <w:bookmarkStart w:id="80" w:name="_Toc224562823"/>
       <w:r>
         <w:rPr>
           <w:rFonts w:hint="eastAsia"/>
@@ -19355,7 +19355,7 @@
       <w:pPr>
         <w:pStyle w:val="3"/>
       </w:pPr>
-      <w:bookmarkStart w:id="81" w:name="_Toc217309249"/>
+      <w:bookmarkStart w:id="81" w:name="_Toc224562824"/>
       <w:r>
         <w:rPr>
           <w:rFonts w:hint="eastAsia"/>
@@ -19503,7 +19503,7 @@
       <w:pPr>
         <w:pStyle w:val="3"/>
       </w:pPr>
-      <w:bookmarkStart w:id="82" w:name="_Toc217309250"/>
+      <w:bookmarkStart w:id="82" w:name="_Toc224562825"/>
       <w:r>
         <w:rPr>
           <w:rFonts w:hint="eastAsia"/>
@@ -19886,7 +19886,7 @@
       <w:pPr>
         <w:pStyle w:val="3"/>
       </w:pPr>
-      <w:bookmarkStart w:id="83" w:name="_Toc217309251"/>
+      <w:bookmarkStart w:id="83" w:name="_Toc224562826"/>
       <w:r>
         <w:rPr>
           <w:rFonts w:hint="eastAsia"/>
@@ -20051,7 +20051,7 @@
         <w:pStyle w:val="2"/>
       </w:pPr>
       <w:bookmarkStart w:id="84" w:name="_Toc14063"/>
-      <w:bookmarkStart w:id="85" w:name="_Toc217309252"/>
+      <w:bookmarkStart w:id="85" w:name="_Toc224562827"/>
       <w:r>
         <w:rPr>
           <w:rFonts w:hint="eastAsia"/>
@@ -20066,7 +20066,7 @@
         <w:pStyle w:val="3"/>
       </w:pPr>
       <w:bookmarkStart w:id="86" w:name="_Toc7114"/>
-      <w:bookmarkStart w:id="87" w:name="_Toc217309253"/>
+      <w:bookmarkStart w:id="87" w:name="_Toc224562828"/>
       <w:r>
         <w:rPr>
           <w:rFonts w:hint="eastAsia"/>
@@ -20733,7 +20733,7 @@
         <w:pStyle w:val="3"/>
       </w:pPr>
       <w:bookmarkStart w:id="88" w:name="_Toc8948"/>
-      <w:bookmarkStart w:id="89" w:name="_Toc217309254"/>
+      <w:bookmarkStart w:id="89" w:name="_Toc224562829"/>
       <w:r>
         <w:rPr>
           <w:rFonts w:hint="eastAsia"/>
@@ -20835,7 +20835,7 @@
       <w:pPr>
         <w:pStyle w:val="3"/>
       </w:pPr>
-      <w:bookmarkStart w:id="90" w:name="_Toc217309255"/>
+      <w:bookmarkStart w:id="90" w:name="_Toc224562830"/>
       <w:r>
         <w:rPr>
           <w:rFonts w:hint="eastAsia"/>
@@ -20933,7 +20933,7 @@
       <w:pPr>
         <w:pStyle w:val="2"/>
       </w:pPr>
-      <w:bookmarkStart w:id="91" w:name="_Toc217309256"/>
+      <w:bookmarkStart w:id="91" w:name="_Toc224562831"/>
       <w:r>
         <w:rPr>
           <w:rFonts w:hint="eastAsia"/>
@@ -20954,7 +20954,7 @@
       <w:pPr>
         <w:pStyle w:val="3"/>
       </w:pPr>
-      <w:bookmarkStart w:id="92" w:name="_Toc217309257"/>
+      <w:bookmarkStart w:id="92" w:name="_Toc224562832"/>
       <w:r>
         <w:rPr>
           <w:rFonts w:hint="eastAsia"/>
@@ -21140,7 +21140,7 @@
       <w:pPr>
         <w:pStyle w:val="3"/>
       </w:pPr>
-      <w:bookmarkStart w:id="93" w:name="_Toc217309258"/>
+      <w:bookmarkStart w:id="93" w:name="_Toc224562833"/>
       <w:r>
         <w:rPr>
           <w:rFonts w:hint="eastAsia"/>
@@ -21326,7 +21326,7 @@
       <w:pPr>
         <w:pStyle w:val="3"/>
       </w:pPr>
-      <w:bookmarkStart w:id="94" w:name="_Toc217309259"/>
+      <w:bookmarkStart w:id="94" w:name="_Toc224562834"/>
       <w:r>
         <w:rPr>
           <w:rFonts w:hint="eastAsia"/>
@@ -21517,7 +21517,7 @@
       <w:pPr>
         <w:pStyle w:val="2"/>
       </w:pPr>
-      <w:bookmarkStart w:id="95" w:name="_Toc217309260"/>
+      <w:bookmarkStart w:id="95" w:name="_Toc224562835"/>
       <w:r>
         <w:rPr>
           <w:rFonts w:hint="eastAsia"/>
@@ -21537,7 +21537,7 @@
       <w:pPr>
         <w:pStyle w:val="3"/>
       </w:pPr>
-      <w:bookmarkStart w:id="96" w:name="_Toc217309261"/>
+      <w:bookmarkStart w:id="96" w:name="_Toc224562836"/>
       <w:r>
         <w:rPr>
           <w:rFonts w:hint="eastAsia"/>
@@ -21672,7 +21672,7 @@
       <w:pPr>
         <w:pStyle w:val="3"/>
       </w:pPr>
-      <w:bookmarkStart w:id="97" w:name="_Toc217309262"/>
+      <w:bookmarkStart w:id="97" w:name="_Toc224562837"/>
       <w:r>
         <w:rPr>
           <w:rFonts w:hint="eastAsia"/>
@@ -21830,7 +21830,7 @@
       <w:pPr>
         <w:pStyle w:val="3"/>
       </w:pPr>
-      <w:bookmarkStart w:id="98" w:name="_Toc217309263"/>
+      <w:bookmarkStart w:id="98" w:name="_Toc224562838"/>
       <w:r>
         <w:rPr>
           <w:rFonts w:hint="eastAsia"/>
@@ -22060,7 +22060,7 @@
       <w:pPr>
         <w:pStyle w:val="2"/>
       </w:pPr>
-      <w:bookmarkStart w:id="99" w:name="_Toc217309264"/>
+      <w:bookmarkStart w:id="99" w:name="_Toc224562839"/>
       <w:r>
         <w:rPr>
           <w:rFonts w:hint="eastAsia"/>
@@ -22074,7 +22074,7 @@
       <w:pPr>
         <w:pStyle w:val="3"/>
       </w:pPr>
-      <w:bookmarkStart w:id="100" w:name="_Toc217309265"/>
+      <w:bookmarkStart w:id="100" w:name="_Toc224562840"/>
       <w:r>
         <w:rPr>
           <w:rFonts w:hint="eastAsia"/>
@@ -22337,7 +22337,7 @@
       <w:pPr>
         <w:pStyle w:val="3"/>
       </w:pPr>
-      <w:bookmarkStart w:id="101" w:name="_Toc217309266"/>
+      <w:bookmarkStart w:id="101" w:name="_Toc224562841"/>
       <w:r>
         <w:rPr>
           <w:rFonts w:hint="eastAsia"/>
@@ -22520,7 +22520,7 @@
       <w:pPr>
         <w:pStyle w:val="3"/>
       </w:pPr>
-      <w:bookmarkStart w:id="102" w:name="_Toc217309267"/>
+      <w:bookmarkStart w:id="102" w:name="_Toc224562842"/>
       <w:r>
         <w:rPr>
           <w:rFonts w:hint="eastAsia"/>
@@ -22788,7 +22788,7 @@
       <w:pPr>
         <w:pStyle w:val="1"/>
       </w:pPr>
-      <w:bookmarkStart w:id="103" w:name="_Toc217309268"/>
+      <w:bookmarkStart w:id="103" w:name="_Toc224562843"/>
       <w:r>
         <w:rPr>
           <w:rFonts w:hint="eastAsia"/>
@@ -22850,7 +22850,7 @@
       <w:pPr>
         <w:pStyle w:val="2"/>
       </w:pPr>
-      <w:bookmarkStart w:id="104" w:name="_Toc217309269"/>
+      <w:bookmarkStart w:id="104" w:name="_Toc224562844"/>
       <w:r>
         <w:rPr>
           <w:rFonts w:hint="eastAsia"/>
@@ -22863,7 +22863,7 @@
       <w:pPr>
         <w:pStyle w:val="3"/>
       </w:pPr>
-      <w:bookmarkStart w:id="105" w:name="_Toc217309270"/>
+      <w:bookmarkStart w:id="105" w:name="_Toc224562845"/>
       <w:r>
         <w:rPr>
           <w:rFonts w:hint="eastAsia"/>
@@ -22909,7 +22909,7 @@
       <w:pPr>
         <w:pStyle w:val="3"/>
       </w:pPr>
-      <w:bookmarkStart w:id="106" w:name="_Toc217309271"/>
+      <w:bookmarkStart w:id="106" w:name="_Toc224562846"/>
       <w:r>
         <w:rPr>
           <w:rFonts w:hint="eastAsia"/>
@@ -22938,7 +22938,7 @@
       <w:pPr>
         <w:pStyle w:val="2"/>
       </w:pPr>
-      <w:bookmarkStart w:id="107" w:name="_Toc217309272"/>
+      <w:bookmarkStart w:id="107" w:name="_Toc224562847"/>
       <w:r>
         <w:rPr>
           <w:rFonts w:hint="eastAsia"/>
@@ -22951,7 +22951,7 @@
       <w:pPr>
         <w:pStyle w:val="3"/>
       </w:pPr>
-      <w:bookmarkStart w:id="108" w:name="_Toc217309273"/>
+      <w:bookmarkStart w:id="108" w:name="_Toc224562848"/>
       <w:r>
         <w:rPr>
           <w:rFonts w:hint="eastAsia"/>
@@ -22997,7 +22997,7 @@
       <w:pPr>
         <w:pStyle w:val="3"/>
       </w:pPr>
-      <w:bookmarkStart w:id="109" w:name="_Toc217309274"/>
+      <w:bookmarkStart w:id="109" w:name="_Toc224562849"/>
       <w:r>
         <w:rPr>
           <w:rFonts w:hint="eastAsia"/>
@@ -23019,7 +23019,7 @@
       <w:pPr>
         <w:pStyle w:val="2"/>
       </w:pPr>
-      <w:bookmarkStart w:id="110" w:name="_Toc217309275"/>
+      <w:bookmarkStart w:id="110" w:name="_Toc224562850"/>
       <w:r>
         <w:rPr>
           <w:rFonts w:hint="eastAsia"/>
@@ -23032,7 +23032,7 @@
       <w:pPr>
         <w:pStyle w:val="3"/>
       </w:pPr>
-      <w:bookmarkStart w:id="111" w:name="_Toc217309276"/>
+      <w:bookmarkStart w:id="111" w:name="_Toc224562851"/>
       <w:r>
         <w:rPr>
           <w:rFonts w:hint="eastAsia"/>
@@ -23078,7 +23078,7 @@
       <w:pPr>
         <w:pStyle w:val="3"/>
       </w:pPr>
-      <w:bookmarkStart w:id="112" w:name="_Toc217309277"/>
+      <w:bookmarkStart w:id="112" w:name="_Toc224562852"/>
       <w:r>
         <w:rPr>
           <w:rFonts w:hint="eastAsia"/>
@@ -23099,7 +23099,7 @@
       <w:pPr>
         <w:pStyle w:val="1"/>
       </w:pPr>
-      <w:bookmarkStart w:id="113" w:name="_Toc217309278"/>
+      <w:bookmarkStart w:id="113" w:name="_Toc224562853"/>
       <w:r>
         <w:rPr>
           <w:rFonts w:hint="eastAsia"/>
@@ -23118,7 +23118,7 @@
       <w:pPr>
         <w:pStyle w:val="2"/>
       </w:pPr>
-      <w:bookmarkStart w:id="114" w:name="_Toc217309279"/>
+      <w:bookmarkStart w:id="114" w:name="_Toc224562854"/>
       <w:r>
         <w:rPr>
           <w:rFonts w:hint="eastAsia"/>
@@ -23164,7 +23164,7 @@
       <w:pPr>
         <w:pStyle w:val="2"/>
       </w:pPr>
-      <w:bookmarkStart w:id="115" w:name="_Toc217309280"/>
+      <w:bookmarkStart w:id="115" w:name="_Toc224562855"/>
       <w:r>
         <w:rPr>
           <w:rFonts w:hint="eastAsia"/>
@@ -23236,7 +23236,7 @@
       <w:pPr>
         <w:pStyle w:val="2"/>
       </w:pPr>
-      <w:bookmarkStart w:id="116" w:name="_Toc217309281"/>
+      <w:bookmarkStart w:id="116" w:name="_Toc224562856"/>
       <w:r>
         <w:rPr>
           <w:rFonts w:hint="eastAsia"/>
@@ -23277,7 +23277,7 @@
       <w:pPr>
         <w:pStyle w:val="3"/>
       </w:pPr>
-      <w:bookmarkStart w:id="117" w:name="_Toc217309282"/>
+      <w:bookmarkStart w:id="117" w:name="_Toc224562857"/>
       <w:r>
         <w:rPr>
           <w:rFonts w:hint="eastAsia"/>
@@ -23306,7 +23306,7 @@
       <w:pPr>
         <w:pStyle w:val="3"/>
       </w:pPr>
-      <w:bookmarkStart w:id="118" w:name="_Toc217309283"/>
+      <w:bookmarkStart w:id="118" w:name="_Toc224562858"/>
       <w:r>
         <w:rPr>
           <w:rFonts w:hint="eastAsia"/>
@@ -23343,7 +23343,7 @@
       <w:pPr>
         <w:pStyle w:val="3"/>
       </w:pPr>
-      <w:bookmarkStart w:id="119" w:name="_Toc217309284"/>
+      <w:bookmarkStart w:id="119" w:name="_Toc224562859"/>
       <w:r>
         <w:rPr>
           <w:rFonts w:hint="eastAsia"/>
@@ -23372,7 +23372,7 @@
       <w:pPr>
         <w:pStyle w:val="3"/>
       </w:pPr>
-      <w:bookmarkStart w:id="120" w:name="_Toc217309285"/>
+      <w:bookmarkStart w:id="120" w:name="_Toc224562860"/>
       <w:r>
         <w:rPr>
           <w:rFonts w:hint="eastAsia"/>
@@ -23438,7 +23438,7 @@
       <w:pPr>
         <w:pStyle w:val="2"/>
       </w:pPr>
-      <w:bookmarkStart w:id="121" w:name="_Toc217309286"/>
+      <w:bookmarkStart w:id="121" w:name="_Toc224562861"/>
       <w:r>
         <w:rPr>
           <w:rFonts w:hint="eastAsia"/>
@@ -23718,7 +23718,7 @@
       <w:pPr>
         <w:pStyle w:val="2"/>
       </w:pPr>
-      <w:bookmarkStart w:id="122" w:name="_Toc217309287"/>
+      <w:bookmarkStart w:id="122" w:name="_Toc224562862"/>
       <w:r>
         <w:rPr>
           <w:rFonts w:hint="eastAsia"/>
@@ -23739,7 +23739,7 @@
       <w:pPr>
         <w:pStyle w:val="3"/>
       </w:pPr>
-      <w:bookmarkStart w:id="123" w:name="_Toc217309288"/>
+      <w:bookmarkStart w:id="123" w:name="_Toc224562863"/>
       <w:r>
         <w:rPr>
           <w:rFonts w:hint="eastAsia"/>
@@ -23760,7 +23760,7 @@
       <w:pPr>
         <w:pStyle w:val="3"/>
       </w:pPr>
-      <w:bookmarkStart w:id="124" w:name="_Toc217309289"/>
+      <w:bookmarkStart w:id="124" w:name="_Toc224562864"/>
       <w:r>
         <w:rPr>
           <w:rFonts w:hint="eastAsia"/>
@@ -23809,7 +23809,7 @@
       <w:pPr>
         <w:pStyle w:val="2"/>
       </w:pPr>
-      <w:bookmarkStart w:id="125" w:name="_Toc217309290"/>
+      <w:bookmarkStart w:id="125" w:name="_Toc224562865"/>
       <w:r>
         <w:rPr>
           <w:rFonts w:hint="eastAsia"/>
@@ -23830,7 +23830,7 @@
       <w:pPr>
         <w:pStyle w:val="3"/>
       </w:pPr>
-      <w:bookmarkStart w:id="126" w:name="_Toc217309291"/>
+      <w:bookmarkStart w:id="126" w:name="_Toc224562866"/>
       <w:r>
         <w:rPr>
           <w:rFonts w:hint="eastAsia"/>
@@ -23851,7 +23851,7 @@
       <w:pPr>
         <w:pStyle w:val="3"/>
       </w:pPr>
-      <w:bookmarkStart w:id="127" w:name="_Toc217309292"/>
+      <w:bookmarkStart w:id="127" w:name="_Toc224562867"/>
       <w:r>
         <w:rPr>
           <w:rFonts w:hint="eastAsia"/>
@@ -23872,7 +23872,7 @@
       <w:pPr>
         <w:pStyle w:val="1"/>
       </w:pPr>
-      <w:bookmarkStart w:id="128" w:name="_Toc217309293"/>
+      <w:bookmarkStart w:id="128" w:name="_Toc224562868"/>
       <w:r>
         <w:rPr>
           <w:rFonts w:hint="eastAsia"/>
@@ -23898,7 +23898,7 @@
       <w:pPr>
         <w:pStyle w:val="2"/>
       </w:pPr>
-      <w:bookmarkStart w:id="129" w:name="_Toc217309294"/>
+      <w:bookmarkStart w:id="129" w:name="_Toc224562869"/>
       <w:r>
         <w:rPr>
           <w:rFonts w:hint="eastAsia"/>
@@ -23920,7 +23920,7 @@
         <w:pStyle w:val="3"/>
       </w:pPr>
       <w:bookmarkStart w:id="130" w:name="_Toc24741"/>
-      <w:bookmarkStart w:id="131" w:name="_Toc217309295"/>
+      <w:bookmarkStart w:id="131" w:name="_Toc224562870"/>
       <w:r>
         <w:rPr>
           <w:rFonts w:hint="eastAsia"/>
@@ -24005,7 +24005,7 @@
       <w:pPr>
         <w:pStyle w:val="3"/>
       </w:pPr>
-      <w:bookmarkStart w:id="132" w:name="_Toc217309296"/>
+      <w:bookmarkStart w:id="132" w:name="_Toc224562871"/>
       <w:r>
         <w:rPr>
           <w:rFonts w:hint="eastAsia"/>
@@ -24129,7 +24129,7 @@
         <w:pStyle w:val="3"/>
       </w:pPr>
       <w:bookmarkStart w:id="133" w:name="_Toc21616"/>
-      <w:bookmarkStart w:id="134" w:name="_Toc217309297"/>
+      <w:bookmarkStart w:id="134" w:name="_Toc224562872"/>
       <w:r>
         <w:rPr>
           <w:rFonts w:hint="eastAsia"/>
@@ -24305,7 +24305,7 @@
       <w:pPr>
         <w:pStyle w:val="3"/>
       </w:pPr>
-      <w:bookmarkStart w:id="135" w:name="_Toc217309298"/>
+      <w:bookmarkStart w:id="135" w:name="_Toc224562873"/>
       <w:r>
         <w:rPr>
           <w:rFonts w:hint="eastAsia"/>
@@ -24403,7 +24403,7 @@
       <w:pPr>
         <w:pStyle w:val="3"/>
       </w:pPr>
-      <w:bookmarkStart w:id="137" w:name="_Toc217309299"/>
+      <w:bookmarkStart w:id="137" w:name="_Toc224562874"/>
       <w:r>
         <w:rPr>
           <w:rFonts w:hint="eastAsia"/>
@@ -24465,20 +24465,14 @@
         <w:rPr>
           <w:rFonts w:hint="eastAsia"/>
         </w:rPr>
-        <w:t>:password,number</w:t>
-      </w:r>
-      <w:r>
-        <w:rPr>
-          <w:rFonts w:hint="eastAsia"/>
-        </w:rPr>
-        <w:t xml:space="preserve"> or word</w:t>
+        <w:t>:password,number or word</w:t>
       </w:r>
     </w:p>
     <w:p>
       <w:pPr>
         <w:pStyle w:val="3"/>
       </w:pPr>
-      <w:bookmarkStart w:id="138" w:name="_Toc217309300"/>
+      <w:bookmarkStart w:id="138" w:name="_Toc224562875"/>
       <w:r>
         <w:rPr>
           <w:rFonts w:hint="eastAsia"/>
@@ -24586,7 +24580,7 @@
       <w:pPr>
         <w:pStyle w:val="3"/>
       </w:pPr>
-      <w:bookmarkStart w:id="139" w:name="_Toc217309301"/>
+      <w:bookmarkStart w:id="139" w:name="_Toc224562876"/>
       <w:r>
         <w:rPr>
           <w:rFonts w:hint="eastAsia"/>
@@ -24724,7 +24718,7 @@
       <w:pPr>
         <w:pStyle w:val="3"/>
       </w:pPr>
-      <w:bookmarkStart w:id="140" w:name="_Toc217309302"/>
+      <w:bookmarkStart w:id="140" w:name="_Toc224562877"/>
       <w:r>
         <w:rPr>
           <w:rFonts w:hint="eastAsia"/>
@@ -24787,7 +24781,7 @@
       <w:pPr>
         <w:pStyle w:val="3"/>
       </w:pPr>
-      <w:bookmarkStart w:id="141" w:name="_Toc217309303"/>
+      <w:bookmarkStart w:id="141" w:name="_Toc224562878"/>
       <w:r>
         <w:rPr>
           <w:rFonts w:hint="eastAsia"/>
@@ -24898,7 +24892,7 @@
           <w:numId w:val="6"/>
         </w:numPr>
       </w:pPr>
-      <w:bookmarkStart w:id="142" w:name="_Toc217309304"/>
+      <w:bookmarkStart w:id="142" w:name="_Toc224562879"/>
       <w:r>
         <w:rPr>
           <w:rFonts w:hint="eastAsia"/>
@@ -25055,7 +25049,7 @@
       <w:pPr>
         <w:pStyle w:val="2"/>
       </w:pPr>
-      <w:bookmarkStart w:id="143" w:name="_Toc217309305"/>
+      <w:bookmarkStart w:id="143" w:name="_Toc224562880"/>
       <w:r>
         <w:rPr>
           <w:rFonts w:hint="eastAsia"/>
@@ -25322,7 +25316,7 @@
       <w:pPr>
         <w:pStyle w:val="1"/>
       </w:pPr>
-      <w:bookmarkStart w:id="144" w:name="_Toc217309306"/>
+      <w:bookmarkStart w:id="144" w:name="_Toc224562881"/>
       <w:r>
         <w:rPr>
           <w:rFonts w:hint="eastAsia"/>
@@ -25336,7 +25330,7 @@
         <w:pStyle w:val="2"/>
       </w:pPr>
       <w:bookmarkStart w:id="145" w:name="_Toc5865"/>
-      <w:bookmarkStart w:id="146" w:name="_Toc217309307"/>
+      <w:bookmarkStart w:id="146" w:name="_Toc224562882"/>
       <w:r>
         <w:rPr>
           <w:rFonts w:hint="eastAsia"/>
@@ -25365,7 +25359,7 @@
         <w:pStyle w:val="2"/>
       </w:pPr>
       <w:bookmarkStart w:id="147" w:name="_Toc27100"/>
-      <w:bookmarkStart w:id="148" w:name="_Toc217309308"/>
+      <w:bookmarkStart w:id="148" w:name="_Toc224562883"/>
       <w:r>
         <w:rPr>
           <w:rFonts w:hint="eastAsia"/>
@@ -25398,7 +25392,7 @@
         <w:pStyle w:val="2"/>
       </w:pPr>
       <w:bookmarkStart w:id="149" w:name="_Toc255"/>
-      <w:bookmarkStart w:id="150" w:name="_Toc217309309"/>
+      <w:bookmarkStart w:id="150" w:name="_Toc224562884"/>
       <w:r>
         <w:rPr>
           <w:rFonts w:hint="eastAsia"/>
@@ -25423,8 +25417,12 @@
       </w:r>
     </w:p>
     <w:sectPr>
-      <w:headerReference w:type="default" r:id="rId9"/>
-      <w:footerReference w:type="default" r:id="rId10"/>
+      <w:headerReference w:type="even" r:id="rId9"/>
+      <w:headerReference w:type="default" r:id="rId10"/>
+      <w:footerReference w:type="even" r:id="rId11"/>
+      <w:footerReference w:type="default" r:id="rId12"/>
+      <w:headerReference w:type="first" r:id="rId13"/>
+      <w:footerReference w:type="first" r:id="rId14"/>
       <w:pgSz w:w="11906" w:h="16838"/>
       <w:pgMar w:top="1440" w:right="1800" w:bottom="1440" w:left="1800" w:header="851" w:footer="992" w:gutter="0"/>
       <w:cols w:space="425"/>
@@ -25454,6 +25452,16 @@
 </file>
 
 <file path=word/footer1.xml><?xml version="1.0" encoding="utf-8"?>
+<w:ftr xmlns:wpc="http://schemas.microsoft.com/office/word/2010/wordprocessingCanvas" xmlns:cx="http://schemas.microsoft.com/office/drawing/2014/chartex" xmlns:cx1="http://schemas.microsoft.com/office/drawing/2015/9/8/chartex" xmlns:cx2="http://schemas.microsoft.com/office/drawing/2015/10/21/chartex" xmlns:cx3="http://schemas.microsoft.com/office/drawing/2016/5/9/chartex" xmlns:cx4="http://schemas.microsoft.com/office/drawing/2016/5/10/chartex" xmlns:cx5="http://schemas.microsoft.com/office/drawing/2016/5/11/chartex" xmlns:cx6="http://schemas.microsoft.com/office/drawing/2016/5/12/chartex" xmlns:cx7="http://schemas.microsoft.com/office/drawing/2016/5/13/chartex" xmlns:cx8="http://schemas.microsoft.com/office/drawing/2016/5/14/chartex" xmlns:mc="http://schemas.openxmlformats.org/markup-compatibility/2006" xmlns:aink="http://schemas.microsoft.com/office/drawing/2016/ink" xmlns:am3d="http://schemas.microsoft.com/office/drawing/2017/model3d" xmlns:o="urn:schemas-microsoft-com:office:office" xmlns:oel="http://schemas.microsoft.com/office/2019/extlst" xmlns:r="http://schemas.openxmlformats.org/officeDocument/2006/relationships" xmlns:m="http://schemas.openxmlformats.org/officeDocument/2006/math" xmlns:v="urn:schemas-microsoft-com:vml" xmlns:wp14="http://schemas.microsoft.com/office/word/2010/wordprocessingDrawing" xmlns:wp="http://schemas.openxmlformats.org/drawingml/2006/wordprocessingDrawing" xmlns:w10="urn:schemas-microsoft-com:office:word" xmlns:w="http://schemas.openxmlformats.org/wordprocessingml/2006/main" xmlns:w14="http://schemas.microsoft.com/office/word/2010/wordml" xmlns:w15="http://schemas.microsoft.com/office/word/2012/wordml" xmlns:w16cex="http://schemas.microsoft.com/office/word/2018/wordml/cex" xmlns:w16cid="http://schemas.microsoft.com/office/word/2016/wordml/cid" xmlns:w16="http://schemas.microsoft.com/office/word/2018/wordml" xmlns:w16du="http://schemas.microsoft.com/office/word/2023/wordml/word16du" xmlns:w16sdtdh="http://schemas.microsoft.com/office/word/2020/wordml/sdtdatahash" xmlns:w16sdtfl="http://schemas.microsoft.com/office/word/2024/wordml/sdtformatlock" xmlns:w16se="http://schemas.microsoft.com/office/word/2015/wordml/symex" xmlns:wpg="http://schemas.microsoft.com/office/word/2010/wordprocessingGroup" xmlns:wpi="http://schemas.microsoft.com/office/word/2010/wordprocessingInk" xmlns:wne="http://schemas.microsoft.com/office/word/2006/wordml" xmlns:wps="http://schemas.microsoft.com/office/word/2010/wordprocessingShape" mc:Ignorable="w14 w15 w16se w16cid w16 w16cex w16sdtdh w16sdtfl w16du wp14">
+  <w:p>
+    <w:pPr>
+      <w:pStyle w:val="a4"/>
+    </w:pPr>
+  </w:p>
+</w:ftr>
+</file>
+
+<file path=word/footer2.xml><?xml version="1.0" encoding="utf-8"?>
 <w:ftr xmlns:wpc="http://schemas.microsoft.com/office/word/2010/wordprocessingCanvas" xmlns:cx="http://schemas.microsoft.com/office/drawing/2014/chartex" xmlns:cx1="http://schemas.microsoft.com/office/drawing/2015/9/8/chartex" xmlns:cx2="http://schemas.microsoft.com/office/drawing/2015/10/21/chartex" xmlns:cx3="http://schemas.microsoft.com/office/drawing/2016/5/9/chartex" xmlns:cx4="http://schemas.microsoft.com/office/drawing/2016/5/10/chartex" xmlns:cx5="http://schemas.microsoft.com/office/drawing/2016/5/11/chartex" xmlns:cx6="http://schemas.microsoft.com/office/drawing/2016/5/12/chartex" xmlns:cx7="http://schemas.microsoft.com/office/drawing/2016/5/13/chartex" xmlns:cx8="http://schemas.microsoft.com/office/drawing/2016/5/14/chartex" xmlns:mc="http://schemas.openxmlformats.org/markup-compatibility/2006" xmlns:aink="http://schemas.microsoft.com/office/drawing/2016/ink" xmlns:am3d="http://schemas.microsoft.com/office/drawing/2017/model3d" xmlns:o="urn:schemas-microsoft-com:office:office" xmlns:oel="http://schemas.microsoft.com/office/2019/extlst" xmlns:r="http://schemas.openxmlformats.org/officeDocument/2006/relationships" xmlns:m="http://schemas.openxmlformats.org/officeDocument/2006/math" xmlns:v="urn:schemas-microsoft-com:vml" xmlns:wp14="http://schemas.microsoft.com/office/word/2010/wordprocessingDrawing" xmlns:wp="http://schemas.openxmlformats.org/drawingml/2006/wordprocessingDrawing" xmlns:w10="urn:schemas-microsoft-com:office:word" xmlns:w="http://schemas.openxmlformats.org/wordprocessingml/2006/main" xmlns:w14="http://schemas.microsoft.com/office/word/2010/wordml" xmlns:w15="http://schemas.microsoft.com/office/word/2012/wordml" xmlns:w16cex="http://schemas.microsoft.com/office/word/2018/wordml/cex" xmlns:w16cid="http://schemas.microsoft.com/office/word/2016/wordml/cid" xmlns:w16="http://schemas.microsoft.com/office/word/2018/wordml" xmlns:w16du="http://schemas.microsoft.com/office/word/2023/wordml/word16du" xmlns:w16sdtdh="http://schemas.microsoft.com/office/word/2020/wordml/sdtdatahash" xmlns:w16sdtfl="http://schemas.microsoft.com/office/word/2024/wordml/sdtformatlock" xmlns:w16se="http://schemas.microsoft.com/office/word/2015/wordml/symex" xmlns:wpg="http://schemas.microsoft.com/office/word/2010/wordprocessingGroup" xmlns:wpi="http://schemas.microsoft.com/office/word/2010/wordprocessingInk" xmlns:wne="http://schemas.microsoft.com/office/word/2006/wordml" xmlns:wps="http://schemas.microsoft.com/office/word/2010/wordprocessingShape" mc:Ignorable="w14 w15 w16se w16cid w16 w16cex w16sdtdh w16sdtfl w16du wp14">
   <w:p>
     <w:pPr>
@@ -25619,6 +25627,16 @@
 </w:ftr>
 </file>
 
+<file path=word/footer3.xml><?xml version="1.0" encoding="utf-8"?>
+<w:ftr xmlns:wpc="http://schemas.microsoft.com/office/word/2010/wordprocessingCanvas" xmlns:cx="http://schemas.microsoft.com/office/drawing/2014/chartex" xmlns:cx1="http://schemas.microsoft.com/office/drawing/2015/9/8/chartex" xmlns:cx2="http://schemas.microsoft.com/office/drawing/2015/10/21/chartex" xmlns:cx3="http://schemas.microsoft.com/office/drawing/2016/5/9/chartex" xmlns:cx4="http://schemas.microsoft.com/office/drawing/2016/5/10/chartex" xmlns:cx5="http://schemas.microsoft.com/office/drawing/2016/5/11/chartex" xmlns:cx6="http://schemas.microsoft.com/office/drawing/2016/5/12/chartex" xmlns:cx7="http://schemas.microsoft.com/office/drawing/2016/5/13/chartex" xmlns:cx8="http://schemas.microsoft.com/office/drawing/2016/5/14/chartex" xmlns:mc="http://schemas.openxmlformats.org/markup-compatibility/2006" xmlns:aink="http://schemas.microsoft.com/office/drawing/2016/ink" xmlns:am3d="http://schemas.microsoft.com/office/drawing/2017/model3d" xmlns:o="urn:schemas-microsoft-com:office:office" xmlns:oel="http://schemas.microsoft.com/office/2019/extlst" xmlns:r="http://schemas.openxmlformats.org/officeDocument/2006/relationships" xmlns:m="http://schemas.openxmlformats.org/officeDocument/2006/math" xmlns:v="urn:schemas-microsoft-com:vml" xmlns:wp14="http://schemas.microsoft.com/office/word/2010/wordprocessingDrawing" xmlns:wp="http://schemas.openxmlformats.org/drawingml/2006/wordprocessingDrawing" xmlns:w10="urn:schemas-microsoft-com:office:word" xmlns:w="http://schemas.openxmlformats.org/wordprocessingml/2006/main" xmlns:w14="http://schemas.microsoft.com/office/word/2010/wordml" xmlns:w15="http://schemas.microsoft.com/office/word/2012/wordml" xmlns:w16cex="http://schemas.microsoft.com/office/word/2018/wordml/cex" xmlns:w16cid="http://schemas.microsoft.com/office/word/2016/wordml/cid" xmlns:w16="http://schemas.microsoft.com/office/word/2018/wordml" xmlns:w16du="http://schemas.microsoft.com/office/word/2023/wordml/word16du" xmlns:w16sdtdh="http://schemas.microsoft.com/office/word/2020/wordml/sdtdatahash" xmlns:w16sdtfl="http://schemas.microsoft.com/office/word/2024/wordml/sdtformatlock" xmlns:w16se="http://schemas.microsoft.com/office/word/2015/wordml/symex" xmlns:wpg="http://schemas.microsoft.com/office/word/2010/wordprocessingGroup" xmlns:wpi="http://schemas.microsoft.com/office/word/2010/wordprocessingInk" xmlns:wne="http://schemas.microsoft.com/office/word/2006/wordml" xmlns:wps="http://schemas.microsoft.com/office/word/2010/wordprocessingShape" mc:Ignorable="w14 w15 w16se w16cid w16 w16cex w16sdtdh w16sdtfl w16du wp14">
+  <w:p>
+    <w:pPr>
+      <w:pStyle w:val="a4"/>
+    </w:pPr>
+  </w:p>
+</w:ftr>
+</file>
+
 <file path=word/footnotes.xml><?xml version="1.0" encoding="utf-8"?>
 <w:footnotes xmlns:wpc="http://schemas.microsoft.com/office/word/2010/wordprocessingCanvas" xmlns:cx="http://schemas.microsoft.com/office/drawing/2014/chartex" xmlns:cx1="http://schemas.microsoft.com/office/drawing/2015/9/8/chartex" xmlns:cx2="http://schemas.microsoft.com/office/drawing/2015/10/21/chartex" xmlns:cx3="http://schemas.microsoft.com/office/drawing/2016/5/9/chartex" xmlns:cx4="http://schemas.microsoft.com/office/drawing/2016/5/10/chartex" xmlns:cx5="http://schemas.microsoft.com/office/drawing/2016/5/11/chartex" xmlns:cx6="http://schemas.microsoft.com/office/drawing/2016/5/12/chartex" xmlns:cx7="http://schemas.microsoft.com/office/drawing/2016/5/13/chartex" xmlns:cx8="http://schemas.microsoft.com/office/drawing/2016/5/14/chartex" xmlns:mc="http://schemas.openxmlformats.org/markup-compatibility/2006" xmlns:aink="http://schemas.microsoft.com/office/drawing/2016/ink" xmlns:am3d="http://schemas.microsoft.com/office/drawing/2017/model3d" xmlns:o="urn:schemas-microsoft-com:office:office" xmlns:oel="http://schemas.microsoft.com/office/2019/extlst" xmlns:r="http://schemas.openxmlformats.org/officeDocument/2006/relationships" xmlns:m="http://schemas.openxmlformats.org/officeDocument/2006/math" xmlns:v="urn:schemas-microsoft-com:vml" xmlns:wp14="http://schemas.microsoft.com/office/word/2010/wordprocessingDrawing" xmlns:wp="http://schemas.openxmlformats.org/drawingml/2006/wordprocessingDrawing" xmlns:w10="urn:schemas-microsoft-com:office:word" xmlns:w="http://schemas.openxmlformats.org/wordprocessingml/2006/main" xmlns:w14="http://schemas.microsoft.com/office/word/2010/wordml" xmlns:w15="http://schemas.microsoft.com/office/word/2012/wordml" xmlns:w16cex="http://schemas.microsoft.com/office/word/2018/wordml/cex" xmlns:w16cid="http://schemas.microsoft.com/office/word/2016/wordml/cid" xmlns:w16="http://schemas.microsoft.com/office/word/2018/wordml" xmlns:w16du="http://schemas.microsoft.com/office/word/2023/wordml/word16du" xmlns:w16sdtdh="http://schemas.microsoft.com/office/word/2020/wordml/sdtdatahash" xmlns:w16sdtfl="http://schemas.microsoft.com/office/word/2024/wordml/sdtformatlock" xmlns:w16se="http://schemas.microsoft.com/office/word/2015/wordml/symex" xmlns:wpg="http://schemas.microsoft.com/office/word/2010/wordprocessingGroup" xmlns:wpi="http://schemas.microsoft.com/office/word/2010/wordprocessingInk" xmlns:wne="http://schemas.microsoft.com/office/word/2006/wordml" xmlns:wps="http://schemas.microsoft.com/office/word/2010/wordprocessingShape" mc:Ignorable="w14 w15 w16se w16cid w16 w16cex w16sdtdh w16sdtfl w16du wp14">
   <w:footnote w:type="separator" w:id="-1">
@@ -25639,6 +25657,16 @@
 </file>
 
 <file path=word/header1.xml><?xml version="1.0" encoding="utf-8"?>
+<w:hdr xmlns:wpc="http://schemas.microsoft.com/office/word/2010/wordprocessingCanvas" xmlns:cx="http://schemas.microsoft.com/office/drawing/2014/chartex" xmlns:cx1="http://schemas.microsoft.com/office/drawing/2015/9/8/chartex" xmlns:cx2="http://schemas.microsoft.com/office/drawing/2015/10/21/chartex" xmlns:cx3="http://schemas.microsoft.com/office/drawing/2016/5/9/chartex" xmlns:cx4="http://schemas.microsoft.com/office/drawing/2016/5/10/chartex" xmlns:cx5="http://schemas.microsoft.com/office/drawing/2016/5/11/chartex" xmlns:cx6="http://schemas.microsoft.com/office/drawing/2016/5/12/chartex" xmlns:cx7="http://schemas.microsoft.com/office/drawing/2016/5/13/chartex" xmlns:cx8="http://schemas.microsoft.com/office/drawing/2016/5/14/chartex" xmlns:mc="http://schemas.openxmlformats.org/markup-compatibility/2006" xmlns:aink="http://schemas.microsoft.com/office/drawing/2016/ink" xmlns:am3d="http://schemas.microsoft.com/office/drawing/2017/model3d" xmlns:o="urn:schemas-microsoft-com:office:office" xmlns:oel="http://schemas.microsoft.com/office/2019/extlst" xmlns:r="http://schemas.openxmlformats.org/officeDocument/2006/relationships" xmlns:m="http://schemas.openxmlformats.org/officeDocument/2006/math" xmlns:v="urn:schemas-microsoft-com:vml" xmlns:wp14="http://schemas.microsoft.com/office/word/2010/wordprocessingDrawing" xmlns:wp="http://schemas.openxmlformats.org/drawingml/2006/wordprocessingDrawing" xmlns:w10="urn:schemas-microsoft-com:office:word" xmlns:w="http://schemas.openxmlformats.org/wordprocessingml/2006/main" xmlns:w14="http://schemas.microsoft.com/office/word/2010/wordml" xmlns:w15="http://schemas.microsoft.com/office/word/2012/wordml" xmlns:w16cex="http://schemas.microsoft.com/office/word/2018/wordml/cex" xmlns:w16cid="http://schemas.microsoft.com/office/word/2016/wordml/cid" xmlns:w16="http://schemas.microsoft.com/office/word/2018/wordml" xmlns:w16du="http://schemas.microsoft.com/office/word/2023/wordml/word16du" xmlns:w16sdtdh="http://schemas.microsoft.com/office/word/2020/wordml/sdtdatahash" xmlns:w16sdtfl="http://schemas.microsoft.com/office/word/2024/wordml/sdtformatlock" xmlns:w16se="http://schemas.microsoft.com/office/word/2015/wordml/symex" xmlns:wpg="http://schemas.microsoft.com/office/word/2010/wordprocessingGroup" xmlns:wpi="http://schemas.microsoft.com/office/word/2010/wordprocessingInk" xmlns:wne="http://schemas.microsoft.com/office/word/2006/wordml" xmlns:wps="http://schemas.microsoft.com/office/word/2010/wordprocessingShape" mc:Ignorable="w14 w15 w16se w16cid w16 w16cex w16sdtdh w16sdtfl w16du wp14">
+  <w:p>
+    <w:pPr>
+      <w:pStyle w:val="a6"/>
+    </w:pPr>
+  </w:p>
+</w:hdr>
+</file>
+
+<file path=word/header2.xml><?xml version="1.0" encoding="utf-8"?>
 <w:hdr xmlns:wpc="http://schemas.microsoft.com/office/word/2010/wordprocessingCanvas" xmlns:cx="http://schemas.microsoft.com/office/drawing/2014/chartex" xmlns:cx1="http://schemas.microsoft.com/office/drawing/2015/9/8/chartex" xmlns:cx2="http://schemas.microsoft.com/office/drawing/2015/10/21/chartex" xmlns:cx3="http://schemas.microsoft.com/office/drawing/2016/5/9/chartex" xmlns:cx4="http://schemas.microsoft.com/office/drawing/2016/5/10/chartex" xmlns:cx5="http://schemas.microsoft.com/office/drawing/2016/5/11/chartex" xmlns:cx6="http://schemas.microsoft.com/office/drawing/2016/5/12/chartex" xmlns:cx7="http://schemas.microsoft.com/office/drawing/2016/5/13/chartex" xmlns:cx8="http://schemas.microsoft.com/office/drawing/2016/5/14/chartex" xmlns:mc="http://schemas.openxmlformats.org/markup-compatibility/2006" xmlns:aink="http://schemas.microsoft.com/office/drawing/2016/ink" xmlns:am3d="http://schemas.microsoft.com/office/drawing/2017/model3d" xmlns:o="urn:schemas-microsoft-com:office:office" xmlns:oel="http://schemas.microsoft.com/office/2019/extlst" xmlns:r="http://schemas.openxmlformats.org/officeDocument/2006/relationships" xmlns:m="http://schemas.openxmlformats.org/officeDocument/2006/math" xmlns:v="urn:schemas-microsoft-com:vml" xmlns:wp14="http://schemas.microsoft.com/office/word/2010/wordprocessingDrawing" xmlns:wp="http://schemas.openxmlformats.org/drawingml/2006/wordprocessingDrawing" xmlns:w10="urn:schemas-microsoft-com:office:word" xmlns:w="http://schemas.openxmlformats.org/wordprocessingml/2006/main" xmlns:w14="http://schemas.microsoft.com/office/word/2010/wordml" xmlns:w15="http://schemas.microsoft.com/office/word/2012/wordml" xmlns:w16cex="http://schemas.microsoft.com/office/word/2018/wordml/cex" xmlns:w16cid="http://schemas.microsoft.com/office/word/2016/wordml/cid" xmlns:w16="http://schemas.microsoft.com/office/word/2018/wordml" xmlns:w16du="http://schemas.microsoft.com/office/word/2023/wordml/word16du" xmlns:w16sdtdh="http://schemas.microsoft.com/office/word/2020/wordml/sdtdatahash" xmlns:w16sdtfl="http://schemas.microsoft.com/office/word/2024/wordml/sdtformatlock" xmlns:w16se="http://schemas.microsoft.com/office/word/2015/wordml/symex" xmlns:wpg="http://schemas.microsoft.com/office/word/2010/wordprocessingGroup" xmlns:wpi="http://schemas.microsoft.com/office/word/2010/wordprocessingInk" xmlns:wne="http://schemas.microsoft.com/office/word/2006/wordml" xmlns:wps="http://schemas.microsoft.com/office/word/2010/wordprocessingShape" mc:Ignorable="w14 w15 w16se w16cid w16 w16cex w16sdtdh w16sdtfl w16du wp14">
   <w:p>
     <w:pPr>
@@ -25651,6 +25679,16 @@
       </w:rPr>
       <w:t>XEngine                                                                               by:QYT</w:t>
     </w:r>
+  </w:p>
+</w:hdr>
+</file>
+
+<file path=word/header3.xml><?xml version="1.0" encoding="utf-8"?>
+<w:hdr xmlns:wpc="http://schemas.microsoft.com/office/word/2010/wordprocessingCanvas" xmlns:cx="http://schemas.microsoft.com/office/drawing/2014/chartex" xmlns:cx1="http://schemas.microsoft.com/office/drawing/2015/9/8/chartex" xmlns:cx2="http://schemas.microsoft.com/office/drawing/2015/10/21/chartex" xmlns:cx3="http://schemas.microsoft.com/office/drawing/2016/5/9/chartex" xmlns:cx4="http://schemas.microsoft.com/office/drawing/2016/5/10/chartex" xmlns:cx5="http://schemas.microsoft.com/office/drawing/2016/5/11/chartex" xmlns:cx6="http://schemas.microsoft.com/office/drawing/2016/5/12/chartex" xmlns:cx7="http://schemas.microsoft.com/office/drawing/2016/5/13/chartex" xmlns:cx8="http://schemas.microsoft.com/office/drawing/2016/5/14/chartex" xmlns:mc="http://schemas.openxmlformats.org/markup-compatibility/2006" xmlns:aink="http://schemas.microsoft.com/office/drawing/2016/ink" xmlns:am3d="http://schemas.microsoft.com/office/drawing/2017/model3d" xmlns:o="urn:schemas-microsoft-com:office:office" xmlns:oel="http://schemas.microsoft.com/office/2019/extlst" xmlns:r="http://schemas.openxmlformats.org/officeDocument/2006/relationships" xmlns:m="http://schemas.openxmlformats.org/officeDocument/2006/math" xmlns:v="urn:schemas-microsoft-com:vml" xmlns:wp14="http://schemas.microsoft.com/office/word/2010/wordprocessingDrawing" xmlns:wp="http://schemas.openxmlformats.org/drawingml/2006/wordprocessingDrawing" xmlns:w10="urn:schemas-microsoft-com:office:word" xmlns:w="http://schemas.openxmlformats.org/wordprocessingml/2006/main" xmlns:w14="http://schemas.microsoft.com/office/word/2010/wordml" xmlns:w15="http://schemas.microsoft.com/office/word/2012/wordml" xmlns:w16cex="http://schemas.microsoft.com/office/word/2018/wordml/cex" xmlns:w16cid="http://schemas.microsoft.com/office/word/2016/wordml/cid" xmlns:w16="http://schemas.microsoft.com/office/word/2018/wordml" xmlns:w16du="http://schemas.microsoft.com/office/word/2023/wordml/word16du" xmlns:w16sdtdh="http://schemas.microsoft.com/office/word/2020/wordml/sdtdatahash" xmlns:w16sdtfl="http://schemas.microsoft.com/office/word/2024/wordml/sdtformatlock" xmlns:w16se="http://schemas.microsoft.com/office/word/2015/wordml/symex" xmlns:wpg="http://schemas.microsoft.com/office/word/2010/wordprocessingGroup" xmlns:wpi="http://schemas.microsoft.com/office/word/2010/wordprocessingInk" xmlns:wne="http://schemas.microsoft.com/office/word/2006/wordml" xmlns:wps="http://schemas.microsoft.com/office/word/2010/wordprocessingShape" mc:Ignorable="w14 w15 w16se w16cid w16 w16cex w16sdtdh w16sdtfl w16du wp14">
+  <w:p>
+    <w:pPr>
+      <w:pStyle w:val="a6"/>
+    </w:pPr>
   </w:p>
 </w:hdr>
 </file>
@@ -27476,6 +27514,10 @@
 </file>
 
 <file path=customXml/item1.xml><?xml version="1.0" encoding="utf-8"?>
+<b:Sources xmlns:b="http://schemas.openxmlformats.org/officeDocument/2006/bibliography" xmlns="http://schemas.openxmlformats.org/officeDocument/2006/bibliography" SelectedStyle="\APASixthEditionOfficeOnline.xsl" StyleName="APA" Version="6"/>
+</file>
+
+<file path=customXml/item2.xml><?xml version="1.0" encoding="utf-8"?>
 <s:customData xmlns="http://www.wps.cn/officeDocument/2013/wpsCustomData" xmlns:s="http://www.wps.cn/officeDocument/2013/wpsCustomData">
   <customSectProps/>
   <customShpExts>
@@ -27484,22 +27526,18 @@
 </s:customData>
 </file>
 
-<file path=customXml/item2.xml><?xml version="1.0" encoding="utf-8"?>
-<b:Sources xmlns:b="http://schemas.openxmlformats.org/officeDocument/2006/bibliography" xmlns="http://schemas.openxmlformats.org/officeDocument/2006/bibliography" SelectedStyle="\APASixthEditionOfficeOnline.xsl" StyleName="APA" Version="6"/>
+<file path=customXml/itemProps1.xml><?xml version="1.0" encoding="utf-8"?>
+<ds:datastoreItem xmlns:ds="http://schemas.openxmlformats.org/officeDocument/2006/customXml" ds:itemID="{A3C42FEF-274B-4BDA-8559-31DB942021F2}">
+  <ds:schemaRefs>
+    <ds:schemaRef ds:uri="http://schemas.openxmlformats.org/officeDocument/2006/bibliography"/>
+  </ds:schemaRefs>
+</ds:datastoreItem>
 </file>
 
-<file path=customXml/itemProps1.xml><?xml version="1.0" encoding="utf-8"?>
+<file path=customXml/itemProps2.xml><?xml version="1.0" encoding="utf-8"?>
 <ds:datastoreItem xmlns:ds="http://schemas.openxmlformats.org/officeDocument/2006/customXml" ds:itemID="{B1977F7D-205B-4081-913C-38D41E755F92}">
   <ds:schemaRefs>
     <ds:schemaRef ds:uri="http://www.wps.cn/officeDocument/2013/wpsCustomData"/>
   </ds:schemaRefs>
 </ds:datastoreItem>
-</file>
-
-<file path=customXml/itemProps2.xml><?xml version="1.0" encoding="utf-8"?>
-<ds:datastoreItem xmlns:ds="http://schemas.openxmlformats.org/officeDocument/2006/customXml" ds:itemID="{A3C42FEF-274B-4BDA-8559-31DB942021F2}">
-  <ds:schemaRefs>
-    <ds:schemaRef ds:uri="http://schemas.openxmlformats.org/officeDocument/2006/bibliography"/>
-  </ds:schemaRefs>
-</ds:datastoreItem>
 </file>
</xml_diff>